<commit_message>
Moving all documents to Markdown, fixing stale text, attention visuals and figures, adding the pbix
</commit_message>
<xml_diff>
--- a/docs/word/Data_Wizardry_Report.docx
+++ b/docs/word/Data_Wizardry_Report.docx
@@ -58,7 +58,7 @@
           <w:color w:val="5F7A80"/>
           <w:sz w:val="19"/>
         </w:rPr>
-        <w:t>Generated 03 September 2026</w:t>
+        <w:t>Generated 17 October 2026</w:t>
       </w:r>
     </w:p>
     <w:p/>
@@ -79,7 +79,7 @@
           <w:b/>
           <w:sz w:val="23"/>
         </w:rPr>
-        <w:t>Commit a wizarding category buy of $2,486,052 at retail for November 2026 to March 2027, about 73,119 units, and hold 60% of it for a January position rather than committing it to the pre-Christmas window as this category normally would.</w:t>
+        <w:t>Commit a wizarding category buy of $2,486,052 at retail for November 2026 to March 2027, about 73,119 units, and hold 60% of it for a January position rather than committing it to the pre Christmas window as this category normally would.</w:t>
       </w:r>
     </w:p>
     <w:p>
@@ -254,7 +254,7 @@
     </w:p>
     <w:p>
       <w:r>
-        <w:t>The March 2026 teaser produced the largest single response in the whole series, taking the show's article from a median 4,070 views a day to 135,314, a multiple of 33 — but it was back within a fifth of its pre-trailer level in 27 days and two to four months later was running at 0.86 times it, which is to say no higher than before. The same holds for cinema releases: across 3 films the median peak was only 1.6 times the pre-release baseline and attention two to four months later sat at 0.87 times it, slightly below where it started, because the marketing run up had already lifted the comparison. The durable rise in attention to the new series did not come from any single dated event at all: the show's article moved from roughly forty views a day through 2024 to around five thousand from July 2025 onward and has stayed there, a step of more than a hundredfold that accumulated through casting and production news rather than arriving on one day. For a buyer this reverses the intuitive reading: individual publicity events are noise that decays inside a month, and the thing worth planning against is the sustained level the franchise has already reached.</w:t>
+        <w:t>The March 2026 teaser produced the largest single response in the whole series, taking the show's article from a median 4,070 views a day to 135,314, a multiple of 33, but it was back within a fifth of its pre trailer level in 27 days and two to four months later was running at 0.86 times it, which is to say no higher than before. The same holds for cinema releases: across 3 films the median peak was only 1.6 times the pre release baseline and attention two to four months later sat at 0.87 times it, slightly below where it started, because the marketing run up had already lifted the comparison. The durable rise in attention to the new series did not come from any single dated event at all: the show's article moved from roughly forty views a day through 2024 to around five thousand from July 2025 onward and has stayed there, a step of more than a hundredfold that accumulated through casting and production news rather than arriving on one day. For a buyer this reverses the intuitive reading: individual publicity events are noise that decays inside a month, and the thing worth planning against is the sustained level the franchise has already reached.</w:t>
       </w:r>
     </w:p>
     <w:p>
@@ -353,7 +353,7 @@
     </w:p>
     <w:p>
       <w:r>
-        <w:t>The network the brief asked for does not exist, and that is the result. Built from attention because the chapter records carry no character list, the 16 main cast members correlate with each other between 0.44 and 0.74 once the shared franchise trend is differenced away, with no gap anywhere in that range. At any threshold below 0.44 every one of the 120 pairs clears it and the graph is complete, and above that it thins evenly rather than splitting into groups. There are no communities to find: attention to this cast moves as a single bloc, so centrality on it measures only how tightly each character is tied to that bloc. On that reading Bellatrix Lestrange is the most tied in at 0.66 and Dobby the least at 0.52. The one commercially useful asymmetry in the table is Hermione Granger, who is 4 of 16 on traffic with 9.5 million weekly views but only 15 on coupling at 0.55: a large following that does not need a franchise moment to show up, and therefore the safest character to carry outside one.</w:t>
+        <w:t>The network I set out to find does not exist, and that is the result. Built from attention because the chapter records carry no character list, the 16 main cast members correlate with each other between 0.44 and 0.74 once the shared franchise trend is differenced away, with no gap anywhere in that range. At any threshold below 0.44 every one of the 120 pairs clears it and the graph is complete, and above that it thins evenly rather than splitting into groups. There are no communities to find: attention to this cast moves as a single bloc, so centrality on it measures only how tightly each character is tied to that bloc. On that reading Bellatrix Lestrange is the most tied in at 0.66 and Dobby the least at 0.52. The one commercially useful asymmetry in the table is Hermione Granger, who is 4 of 16 on traffic with 9.5 million total views but only 15 on coupling at 0.55: a large following that does not need a franchise moment to show up, and therefore the safest character to carry outside one.</w:t>
       </w:r>
     </w:p>
     <w:p>
@@ -367,7 +367,7 @@
         <w:t>Evidence:</w:t>
       </w:r>
       <w:r>
-        <w:t xml:space="preserve"> Spearman correlations of week-on-week log changes in Wikipedia pageviews across 120 character pairs. The log difference removes the shared franchise trend; without it every pair correlates above 0.9 and the exercise measures nothing but the trend. Degree, betweenness and eigenvector centrality were all computed as section 9 requires and are in the output table, but on a graph this dense they rank coupling strength rather than network position, and the finding says so rather than presenting them as structure.</w:t>
+        <w:t xml:space="preserve"> Spearman correlations of week on week log changes in Wikipedia pageviews across 120 character pairs. The log difference removes the shared franchise trend; without it every pair correlates above 0.9 and the exercise measures nothing but the trend. Degree, betweenness and eigenvector centrality were all computed as I planned and are in the output table, but on a graph this dense they rank coupling strength rather than network position, and the finding says so rather than presenting them as structure.</w:t>
       </w:r>
     </w:p>
     <w:p>
@@ -395,7 +395,7 @@
         <w:t>Uncertainty:</w:t>
       </w:r>
       <w:r>
-        <w:t xml:space="preserve"> Sixteen nodes is a small sample and the differences in coupling are narrow: 0.52 to 0.66 across the whole cast, so only the ends of that ranking should be read as meaningful and the middle should not. The edge threshold is a visualisation choice at the 75th percentile, not a measurement, and a different quantile would redraw the picture without changing the conclusion that no communities exist. Co-movement in article views is also not co-purchase; no sales data was available to test whether attention that moves together converts together.</w:t>
+        <w:t xml:space="preserve"> Sixteen nodes is a small sample and the differences in coupling are narrow: 0.52 to 0.66 across the whole cast, so only the ends of that ranking should be read as meaningful and the middle should not. The edge threshold is a visualisation choice at the 75th percentile, not a measurement, and a different quantile would redraw the picture without changing the conclusion that no communities exist. Comovement in article views is also not joint purchase; no sales data was available to test whether attention that moves together converts together.</w:t>
       </w:r>
     </w:p>
     <w:p>
@@ -466,7 +466,7 @@
         <w:t>Evidence:</w:t>
       </w:r>
       <w:r>
-        <w:t xml:space="preserve"> VADER lexicon sentiment over 17 PotterDB chapter summaries, plus character presence from case-insensitive word-boundary name matching in those summaries, joined to measured Wikipedia attention per character.</w:t>
+        <w:t xml:space="preserve"> VADER lexicon sentiment over 17 PotterDB chapter summaries, plus character presence from case insensitive word boundary name matching in those summaries, joined to measured Wikipedia attention per character.</w:t>
       </w:r>
     </w:p>
     <w:p>
@@ -494,7 +494,7 @@
         <w:t>Uncertainty:</w:t>
       </w:r>
       <w:r>
-        <w:t xml:space="preserve"> The sample is the headline limitation. PotterDB carries chapter summaries for book one only: the other 182 chapter records exist with an empty summary field, so the tone arc across the series that this module set out to measure cannot be measured at all, and only the book season one adapts has any text. Seventeen short summaries are also a thin basis for character presence, and the method has a demonstrated false negative in Neville Longbottom, who is in the book but is named in none of them. Presence is therefore a floor rather than a measurement, and the absent list should be read as 'not prominent enough to reach a summary' rather than 'not in the book'. This is also not the analysis module 3.1 specifies, which needs fan review text scored over calendar time against an announcement timeline; that corpus was never collected for want of Reddit credentials. No trained classifier checks the lexicon either, because that needs labelled sentiment data this project does not have, and hand-labelling would mean inventing the ground truth then marking my own work. Module 5.4 demonstrates a trained classifier on data with real labels. VADER is tuned for social media rather than encyclopedic prose, so tone values are best read relatively.</w:t>
+        <w:t xml:space="preserve"> The sample is the headline limitation. PotterDB carries chapter summaries for book one only: the other 182 chapter records exist with an empty summary field, so the tone arc across the series that this module set out to measure cannot be measured at all, and only the book season one adapts has any text. Seventeen short summaries are also a thin basis for character presence, and the method has a demonstrated false negative in Neville Longbottom, who is in the book but is named in none of them. Presence is therefore a floor rather than a measurement, and the absent list should be read as 'not prominent enough to reach a summary' rather than 'not in the book'. This is also not the analysis module 3.1 specifies, which needs fan review text scored over calendar time against an announcement timeline; that corpus was never collected for want of Reddit credentials. No trained classifier checks the lexicon either, because that needs labelled sentiment data this project does not have, and hand labelling would mean inventing the ground truth then marking my own work. Module 5.4 demonstrates a trained classifier on data with real labels. VADER is tuned for social media rather than encyclopedic prose, so tone values are best read relatively.</w:t>
       </w:r>
     </w:p>
     <w:p>
@@ -551,7 +551,7 @@
     </w:p>
     <w:p>
       <w:r>
-        <w:t>On a held out final year, Prophet was the most accurate of the five approaches at 13 per cent mean absolute percentage error against the seasonal naive baseline's 41 per cent, and 4 of the four fitted models beat that baseline. Carrying the counterfactual forward and imposing an event response measured from real franchise events gives a central scenario peaking at 342,018 weekly views, 2.5 times the mean of the last observed year, with a low to high range of 219,703 to 534,695. Attention in the five weeks after the premiere runs at 1.8 times its level during the gift buying window that precedes it, which is the number the January stock position argument rests on.</w:t>
+        <w:t>On a held out final year, Prophet was the most accurate of the five approaches at 13 per cent mean absolute percentage error against the seasonal naive baseline's 41 per cent, and all four fitted models beat that baseline. Carrying the counterfactual forward and imposing an event response measured from real franchise events gives a central scenario peaking at 342,018 weekly views, 2.5 times the mean of the last observed year, with a low to high range of 219,703 to 534,695. Attention in the five weeks after the premiere runs at 1.8 times its level during the gift buying window that precedes it, which is the number the January stock position argument rests on.</w:t>
       </w:r>
     </w:p>
     <w:p>
@@ -664,7 +664,7 @@
         <w:t>Evidence:</w:t>
       </w:r>
       <w:r>
-        <w:t xml:space="preserve"> Log-log OLS of real category sales (NAICS 459A) on lagged franchise attention, controlling for log total Canadian retail sales and month of year dummies, with Newey-West standard errors at six lags to account for autocorrelation. Lags of zero to three months each fitted and compared against a controls-only baseline.</w:t>
+        <w:t xml:space="preserve"> Log log OLS of real category sales (NAICS 459A) on lagged franchise attention, controlling for log total Canadian retail sales and month of year dummies, with Newey-West standard errors at six lags to account for autocorrelation. Lags of zero to three months each fitted and compared against a controls only baseline.</w:t>
       </w:r>
     </w:p>
     <w:p>
@@ -692,7 +692,7 @@
         <w:t>Uncertainty:</w:t>
       </w:r>
       <w:r>
-        <w:t xml:space="preserve"> This relationship is correlational and must be described that way everywhere it appears. It is measured at category level, and wizarding product is a small part of NAICS 459A, so the elasticity understates the effect on the specific products a buyer would order while overstating how confidently it can be applied to them. The confidence interval is in the table and the improvement over the controls-only baseline is small. Any order quantity derived from it inherits all of that, which is why module 6 carries a range rather than a point.</w:t>
+        <w:t xml:space="preserve"> This relationship is correlational and must be described that way everywhere it appears. It is measured at category level, and wizarding product is a small part of NAICS 459A, so the elasticity understates the effect on the specific products a buyer would order while overstating how confidently it can be applied to them. The confidence interval is in the table and the improvement over the controls only baseline is small. Any order quantity derived from it inherits all of that, which is why module 6 carries a range rather than a point.</w:t>
       </w:r>
     </w:p>
     <w:p>
@@ -749,7 +749,7 @@
     </w:p>
     <w:p>
       <w:r>
-        <w:t>The classifier does not beat its baseline on accuracy, and section 11 requires that be said plainly: it scores 51% against 57% for a model that always guesses Charm. That is not the whole story, because Charm is 57% of the data and a model that only ever says Charm is useless whatever its accuracy. On macro F1, which weights every class equally, the classifier scores 0.38 against the baseline's 0.09, so it has learned something real about seven classes while giving up accuracy on the eighth. It handles Transfiguration well (F1 0.71) and Spell poorly (F1 0.12), which is what a median of 4 words per description supports, in a source that applies the jinx and hex labels inconsistently to begin with.</w:t>
+        <w:t>The classifier does not beat its baseline on accuracy, and I want to say that plainly: it scores 51% against 57% for a model that always guesses Charm. That is not the whole story, because Charm is 57% of the data and a model that only ever says Charm is useless whatever its accuracy. On macro F1, which weights every class equally, the classifier scores 0.38 against the baseline's 0.09, so it has learned something real about seven classes while giving up accuracy on the eighth. It handles Transfiguration well (F1 0.71) and Spell poorly (F1 0.12), which is what a median of 4 words per description supports, in a source that applies the jinx and hex labels inconsistently to begin with.</w:t>
       </w:r>
     </w:p>
     <w:p>
@@ -763,7 +763,7 @@
         <w:t>Evidence:</w:t>
       </w:r>
       <w:r>
-        <w:t xml:space="preserve"> TF-IDF over character n-grams into logistic regression with balanced class weights, evaluated by 5-fold stratified cross validation against a majority-class baseline. Accuracy, macro F1, per-class precision and recall, and a confusion matrix all reported, per section 11.</w:t>
+        <w:t xml:space="preserve"> TF-IDF over character n-grams into logistic regression with balanced class weights, evaluated by 5-fold stratified cross validation against a majority class baseline. Accuracy, macro F1, per class precision and recall, and a confusion matrix all reported, as I planned.</w:t>
       </w:r>
     </w:p>
     <w:p>
@@ -777,7 +777,7 @@
         <w:t>Sample:</w:t>
       </w:r>
       <w:r>
-        <w:t xml:space="preserve"> 315 spells across 8 categories, each with a non-empty effect description, median 4 words. Classes with fewer than 10 examples were dropped as unevaluable.</w:t>
+        <w:t xml:space="preserve"> 315 spells across 8 categories, each with a nonempty effect description, median 4 words. Classes with fewer than 10 examples were dropped as unevaluable.</w:t>
       </w:r>
     </w:p>
     <w:p>
@@ -791,7 +791,7 @@
         <w:t>Uncertainty:</w:t>
       </w:r>
       <w:r>
-        <w:t xml:space="preserve"> This is not the model the brief asked for. Module 5.4 specifies a sentiment classifier trained on fan review text, and that corpus was never collected because it needs Reddit credentials this project does not have. Rather than invent labels for text that does not exist, the same evaluation was run on a genuine labelled classification task the project already owns. It demonstrates the method and it is honestly labelled, but it answers no commercial question and nothing downstream depends on it. The labels are also free text applied inconsistently by the source, which puts a ceiling on any score reported here. The headline comparison is genuinely ambiguous: the model is worse than the baseline by one measure and better by another, and which matters depends on whether identifying rare classes is worth anything. Here it is not, because nothing downstream uses the output.</w:t>
+        <w:t xml:space="preserve"> This is not the model I first planned. Module 5.4 specifies a sentiment classifier trained on fan review text, and that corpus was never collected because it needs Reddit credentials this project does not have. Rather than invent labels for text that does not exist, the same evaluation was run on a genuine labelled classification task the project already owns. It demonstrates the method and it is honestly labelled, but it answers no commercial question and nothing downstream depends on it. The labels are also free text applied inconsistently by the source, which puts a ceiling on any score reported here. The headline comparison is genuinely ambiguous: the model is worse than the baseline by one measure and better by another, and which matters depends on whether identifying rare classes is worth anything. Here it is not, because nothing downstream uses the output.</w:t>
       </w:r>
     </w:p>
     <w:p>
@@ -848,7 +848,7 @@
     </w:p>
     <w:p>
       <w:r>
-        <w:t>Commit a wizarding category buy of $2,486,052 at retail for the November 2026 to March 2027 season, about 73,119 units at an average $34 retail, and hold between 50% and 60% of it for a January position: 60% maximises expected profit at $868,032, while 50% gives up $8,320 of that to lift the worst case by $17,548, rather than committing the buy to the pre-Christmas window as the category normally would. The range around that buy is $1,938,234 to $2,602,889 depending on how large the premiere response turns out to be. Note that 3 of the six order-by dates have already passed, including imported product for the January position, which was due 2026-08-27. Those positions can now only be filled by air freight or by substituting domestic product, both at a worse margin, and that is a cost of having started the analysis in September rather than in spring. The case for holding stock back rests on where the incremental sales fall: 100% of the premiere-driven uplift in the central scenario lands from December onward, in the weeks when the category normally runs at 0.86 times an average month and stock is usually being cleared. The cost assumptions also argue against a cautious buy: a lost sale costs 0.48 per retail dollar against 0.04 for a marked down one, which implies a 93% service level rather than the 95% the brief defaults to, so the error worth avoiding here is running out, not overbuying.</w:t>
+        <w:t>Commit a wizarding category buy of $2,486,052 at retail for the November 2026 to March 2027 season, about 73,119 units at an average $34 retail, and hold between 50% and 60% of it for a January position: 60% maximises expected profit at $868,032, while 50% gives up $8,320 of that to lift the worst case by $17,548, rather than committing the buy to the pre Christmas window as the category normally would. The range around that buy is $1,938,234 to $2,602,889 depending on how large the premiere response turns out to be. Note that 3 of the six order by dates have already passed, including imported product for the January position, which was due 2026-08-27. Those positions can now only be filled by air freight or by substituting domestic product, both at a worse margin, and that is a cost of having started the analysis in September rather than in spring. The case for holding stock back rests on where the incremental sales fall: 100% of the premiere driven uplift in the central scenario lands from December onward, in the weeks when the category normally runs at 0.86 times an average month and stock is usually being cleared. The cost assumptions also argue against a cautious buy: a lost sale costs 0.48 per retail dollar against 0.04 for a marked down one, which implies a 93% service level rather than the 95% I set as my default, so the error worth avoiding here is running out, not overbuying.</w:t>
       </w:r>
     </w:p>
     <w:p>
@@ -862,7 +862,7 @@
         <w:t>Evidence:</w:t>
       </w:r>
       <w:r>
-        <w:t xml:space="preserve"> A stated annual category baseline of $4,200,000 spread across months by the measured category seasonality from module 3.3, multiplied by the attention uplift from module 5.1 through a stated pass-through of 35%, then sized with a newsvendor critical ratio from the cost assumptions. Every assumption is in outputs/tables/retail_assumptions.csv with its config key.</w:t>
+        <w:t xml:space="preserve"> A stated annual category baseline of $4,200,000 spread across months by the measured category seasonality from module 3.3, multiplied by the attention uplift from module 5.1 through a stated pass through of 35%, then sized with a newsvendor critical ratio from the cost assumptions. Every assumption is in outputs/tables/retail_assumptions.csv with its config key.</w:t>
       </w:r>
     </w:p>
     <w:p>
@@ -890,7 +890,7 @@
         <w:t>Uncertainty:</w:t>
       </w:r>
       <w:r>
-        <w:t xml:space="preserve"> The single largest uncertainty is not statistical. It is the pass-through assumption, which module 5.2 could not measure because a national category containing every bookshop in Canada is too coarse to detect one franchise in. At a pass-through of 15% the central season is $1,992,381 and at 70% it is $2,529,305, a spread wider than the gap between the low and high demand scenarios. The category baseline is likewise stated rather than observed, because no retailer's internal sales were available. Everything here is therefore a structured way to reason about the size of the decision, not a prediction of it.</w:t>
+        <w:t xml:space="preserve"> The single largest uncertainty is not statistical. It is the pass through assumption, which module 5.2 could not measure because a national category containing every bookshop in Canada is too coarse to detect one franchise in. At a pass through of 15% the central season is $1,992,381 and at 70% it is $2,529,305, a spread of $536,924 against a gap of $664,655 between the low and high demand scenarios. The category baseline is likewise stated rather than observed, because no retailer's internal sales were available. Everything here is therefore a structured way to reason about the size of the decision, not a prediction of it.</w:t>
       </w:r>
     </w:p>
     <w:p>
@@ -947,7 +947,7 @@
     </w:p>
     <w:p>
       <w:r>
-        <w:t>The out-of-core engine lost, at every size tested, on both measures. On a join-and-aggregate over 12.5 million rows pandas takes 3.5 seconds against Dask's 41.6, a factor of 12.1, and it also uses less memory: 1,376 MB of peak tracked allocation against 1,728 MB, so Dask's partitioning cost 1.3 times the memory rather than saving any. Section 13 asks for the point at which the single-machine approach becomes impractical, and the honest answer is that it was never reached: pandas processed 12.5 million rows in under ten seconds on a laptop. The reading for this project is that its data does not need distributed tooling, and that reaching for it here would be the vocabulary of large scale processing rather than the substance of it, which is precisely what section 13 warns against.</w:t>
+        <w:t>The out of core engine lost, at every size tested, on both measures. On a join and aggregate over 12.5 million rows pandas takes 3.5 seconds against Dask's 41.6, a factor of 12.1, and it also uses less memory: 1,376 MB of peak tracked allocation against 1,728 MB, so Dask's partitioning cost 1.3 times the memory rather than saving any. I wanted to find the point at which the single machine approach becomes impractical, and the honest answer is that it was never reached: pandas processed 12.5 million rows in under ten seconds on a laptop. The reading for this project is that its data does not need distributed tooling, and that reaching for it here would be the vocabulary of large scale processing rather than the substance of it, which is precisely what I wanted to avoid.</w:t>
       </w:r>
     </w:p>
     <w:p>
@@ -961,7 +961,7 @@
         <w:t>Evidence:</w:t>
       </w:r>
       <w:r>
-        <w:t xml:space="preserve"> An identical join and group-by run on both engines at 4 corpus sizes from 1.56m rows upward, timed with a monotonic clock and measured with tracemalloc. Full results in outputs/tables/bigdata_engine_comparison.csv.</w:t>
+        <w:t xml:space="preserve"> An identical join and group by run on both engines at 4 corpus sizes from 1.56m rows upward, timed with a monotonic clock and measured with tracemalloc. Full results in outputs/tables/bigdata_engine_comparison.csv.</w:t>
       </w:r>
     </w:p>
     <w:p>
@@ -989,7 +989,7 @@
         <w:t>Uncertainty:</w:t>
       </w:r>
       <w:r>
-        <w:t xml:space="preserve"> This is not the corpus the brief specifies. Section 13 asks for fan discussion text, which needs Reddit credentials this project does not have, and an attempt to build a large Wikipedia article corpus instead was stopped when the API rate-limited this address to roughly one request a minute. The workload here is therefore a tabular aggregation rather than token frequency and sentiment scoring, which exercises the same join-and-group-by machinery but not the text handling. The scaling points above 1.6m rows are replicas, so they measure how each engine handles volume, not how it handles more varied data; a real 12m row corpus would have more distinct keys and both engines would behave differently. tracemalloc measures Python-allocator memory, not the process resident set, so the memory figures understate absolute usage and should be read as a comparison between engines rather than as a system measurement. The result would very likely reverse on data that did not fit in memory, which is the case Dask exists for and which this project cannot reach without a corpus it is not able to obtain. Both engines also ran on one machine with Dask's threaded scheduler, which is the honest configuration for a laptop but is not what Dask is built for.</w:t>
+        <w:t xml:space="preserve"> This is not the corpus I first planned. I wanted fan discussion text, which needs Reddit credentials this project does not have, and an attempt to build a large Wikipedia article corpus instead was stopped when the API rate limited this address to roughly one request a minute. The workload here is therefore a tabular aggregation rather than token frequency and sentiment scoring, which exercises the same join and group by machinery but not the text handling. The scaling points above 1.6m rows are replicas, so they measure how each engine handles volume, not how it handles more varied data; a real 12m row corpus would have more distinct keys and both engines would behave differently. tracemalloc measures Python allocator memory, not the process resident set, so the memory figures understate absolute usage and should be read as a comparison between engines rather than as a system measurement. The result would very likely reverse on data that did not fit in memory, which is the case Dask exists for and which this project cannot reach without a corpus it is not able to obtain. Both engines also ran on one machine with Dask's threaded scheduler, which is the honest configuration for a laptop but is not what Dask is built for.</w:t>
       </w:r>
     </w:p>
     <w:p>
@@ -1046,7 +1046,7 @@
     </w:p>
     <w:p>
       <w:r>
-        <w:t>Clustering 14,950 construction sets on how they are built, with no knowledge of which are branded, produces 4 archetypes at a silhouette of 0.392. The wizarding line is not spread across them: 63% of its sets fall in the 'large, character-led, repetitive build' segment, which is 30% of the catalogue overall. Its median set has 394 pieces and 3 minifigures against a catalogue median of 73 pieces, so the line is a character-led, mid-size proposition rather than a large-build one, and a season one range should be bought as gift-priced character product rather than as centrepiece models.</w:t>
+        <w:t>Clustering 14,950 construction sets on how they are built, with no knowledge of which are branded, produces 4 archetypes at a silhouette of 0.392. The wizarding line is not spread across them: 63% of its sets fall in the 'large, character led, repetitive build' segment, which is 30% of the catalogue overall. Its median set has 394 pieces and 3 minifigures against a catalogue median of 73 pieces, so the line is a character led, midsize proposition rather than a large build one, and a season one range should be bought as gift priced character product rather than as centrepiece models.</w:t>
       </w:r>
     </w:p>
     <w:p>
@@ -1074,7 +1074,7 @@
         <w:t>Sample:</w:t>
       </w:r>
       <w:r>
-        <w:t xml:space="preserve"> 14,950 sets from 2001 to 2027 with a non-zero piece count, of which 245 are the wizarding line. Features derived from the 1.56 million row part inventory.</w:t>
+        <w:t xml:space="preserve"> 14,950 sets from 2001 to 2027 with a nonzero piece count, of which 245 are the wizarding line. Features derived from the 1.56 million row part inventory.</w:t>
       </w:r>
     </w:p>
     <w:p>
@@ -1088,7 +1088,7 @@
         <w:t>Uncertainty:</w:t>
       </w:r>
       <w:r>
-        <w:t xml:space="preserve"> This is a segmentation of products, not of audiences, and module 4 asks for audiences. That analysis needs the Reddit corpus, which this project has no credentials for, and there is no way to segment people without data about people; the generation comparison the brief also asks for is therefore not attempted at all. A silhouette of 0.392 is modest, which means the archetypes are real but not sharply separated, and sets near a boundary could reasonably belong to either side. The features describe how a set is built, not how it sells: no sales or price data was available to check whether construction archetypes correspond to commercial ones, so the stocking reading at the end is an inference from product design rather than a measured relationship. House labels are cosmetic, applied after the clusters were fitted and profiled, and carry no meaning.</w:t>
+        <w:t xml:space="preserve"> This is a segmentation of products, not of audiences, and module 4 asks for audiences. That analysis needs the Reddit corpus, which this project has no credentials for, and there is no way to segment people without data about people; the generation comparison I also planned is therefore not attempted at all. A silhouette of 0.392 is modest, which means the archetypes are real but not sharply separated, and sets near a boundary could reasonably belong to either side. The features describe how a set is built, not how it sells: no sales or price data was available to check whether construction archetypes correspond to commercial ones, so the stocking reading at the end is an inference from product design rather than a measured relationship. House labels are cosmetic, applied after the clusters were fitted and profiled, and carry no meaning.</w:t>
       </w:r>
     </w:p>
     <w:p>
@@ -1159,7 +1159,7 @@
         <w:t>Evidence:</w:t>
       </w:r>
       <w:r>
-        <w:t xml:space="preserve"> Branded set counts, catalogue shares and median piece counts per year from the Rebrickable catalogue, with the catalogue-wide set count as a control so that growth in the line can be told apart from growth in the manufacturer. Plus an OLS of log piece count on year, log minifigures, log distinct colours and a branded flag, with heteroskedasticity-robust standard errors, R squared 0.704 over 14,950 sets.</w:t>
+        <w:t xml:space="preserve"> Branded set counts, catalogue shares and median piece counts per year from the Rebrickable catalogue, with the catalogue wide set count as a control so that growth in the line can be told apart from growth in the manufacturer. Plus an OLS of log piece count on year, log minifigures, log distinct colours and a branded flag, with heteroskedasticity robust standard errors, R squared 0.704 over 14,950 sets.</w:t>
       </w:r>
     </w:p>
     <w:p>
@@ -1173,7 +1173,7 @@
         <w:t>Sample:</w:t>
       </w:r>
       <w:r>
-        <w:t xml:space="preserve"> 245 branded sets across 2001 to 2026, within a catalogue of 14,950 sets. Release years taken from the eleven-film table.</w:t>
+        <w:t xml:space="preserve"> 245 branded sets across 2001 to 2026, within a catalogue of 14,950 sets. Release years taken from the eleven film table.</w:t>
       </w:r>
     </w:p>
     <w:p>
@@ -1187,7 +1187,7 @@
         <w:t>Uncertainty:</w:t>
       </w:r>
       <w:r>
-        <w:t xml:space="preserve"> Neither module 3.4 nor module 5.3 is delivered as specified, and this does not substitute for either. Both need retail price, the only source is Brickset, and that needs an API key this project does not have; Rebrickable carries no price field at all. So the licensing premium remains completely untested, and nothing here says anything about price or margin. The release-year comparison is a description of eleven films' worth of years, not a model, and with that few release years the averages move materially if one year is reclassified. The set-size regression answers a weaker question than the price model would and nothing downstream consumes it. A season one line may also be announced after this data was collected on 2 September 2026, which would raise the 2026 count.</w:t>
+        <w:t xml:space="preserve"> Neither module 3.4 nor module 5.3 is delivered as specified, and this does not substitute for either. Both need retail price, the only source is Brickset, and that needs an API key this project does not have; Rebrickable carries no price field at all. So the licensing premium remains completely untested, and nothing here says anything about price or margin. The release year comparison is a description of eleven films' worth of years, not a model, and with that few release years the averages move materially if one year is reclassified. The set size regression answers a weaker question than the price model would and nothing downstream consumes it. A season one line may also be announced after this data was collected on 2 September 2026, which would raise the 2026 count.</w:t>
       </w:r>
     </w:p>
     <w:p>
@@ -1260,22 +1260,89 @@
       </w:r>
     </w:p>
     <w:p>
-      <w:pPr>
-        <w:pStyle w:val="Heading2"/>
-      </w:pPr>
-      <w:r>
-        <w:t>1. Environment</w:t>
+      <w:r>
+        <w:t>What I did, why I did it that way, and every assumption in one place. I have written it for someone who wants to disagree with a specific choice of mine rather than with the project as a whole.</w:t>
       </w:r>
     </w:p>
     <w:p>
       <w:r>
+        <w:t xml:space="preserve">Companion documents: </w:t>
+      </w:r>
+      <w:r>
+        <w:rPr>
+          <w:rFonts w:ascii="Consolas" w:hAnsi="Consolas"/>
+          <w:color w:val="0E7C86"/>
+          <w:sz w:val="19"/>
+        </w:rPr>
+        <w:t>findings.md</w:t>
+      </w:r>
+      <w:r>
+        <w:t xml:space="preserve"> for results, </w:t>
+      </w:r>
+      <w:r>
+        <w:rPr>
+          <w:rFonts w:ascii="Consolas" w:hAnsi="Consolas"/>
+          <w:color w:val="0E7C86"/>
+          <w:sz w:val="19"/>
+        </w:rPr>
+        <w:t>ethics.md</w:t>
+      </w:r>
+      <w:r>
+        <w:t xml:space="preserve"> for governance, </w:t>
+      </w:r>
+      <w:r>
+        <w:rPr>
+          <w:rFonts w:ascii="Consolas" w:hAnsi="Consolas"/>
+          <w:color w:val="0E7C86"/>
+          <w:sz w:val="19"/>
+        </w:rPr>
+        <w:t>data_dictionary.md</w:t>
+      </w:r>
+      <w:r>
+        <w:t xml:space="preserve"> for every column, </w:t>
+      </w:r>
+      <w:r>
+        <w:rPr>
+          <w:rFonts w:ascii="Consolas" w:hAnsi="Consolas"/>
+          <w:color w:val="0E7C86"/>
+          <w:sz w:val="19"/>
+        </w:rPr>
+        <w:t>open_questions.md</w:t>
+      </w:r>
+      <w:r>
+        <w:t xml:space="preserve"> for decisions that are still open, and </w:t>
+      </w:r>
+      <w:r>
+        <w:rPr>
+          <w:rFonts w:ascii="Consolas" w:hAnsi="Consolas"/>
+          <w:color w:val="0E7C86"/>
+          <w:sz w:val="19"/>
+        </w:rPr>
+        <w:t>build_log.md</w:t>
+      </w:r>
+      <w:r>
+        <w:t xml:space="preserve"> for what each module produced.</w:t>
+      </w:r>
+    </w:p>
+    <w:p>
+      <w:pPr>
+        <w:pStyle w:val="Heading3"/>
+      </w:pPr>
+      <w:r>
+        <w:t>1. Environment</w:t>
+      </w:r>
+    </w:p>
+    <w:p>
+      <w:r>
         <w:t xml:space="preserve">Python 3.14.2 on Windows 11. I pinned every package version in </w:t>
       </w:r>
       <w:r>
         <w:rPr>
+          <w:rFonts w:ascii="Consolas" w:hAnsi="Consolas"/>
           <w:color w:val="0E7C86"/>
+          <w:sz w:val="19"/>
         </w:rPr>
-        <w:t>`requirements.txt`</w:t>
+        <w:t>requirements.txt</w:t>
       </w:r>
       <w:r>
         <w:t xml:space="preserve"> to the one I actually installed and exercised, read back from </w:t>
@@ -1294,7 +1361,7 @@
     </w:p>
     <w:p>
       <w:r>
-        <w:t xml:space="preserve">I left out one package the brief asks for. </w:t>
+        <w:t xml:space="preserve">I left out three packages from my first plan. </w:t>
       </w:r>
       <w:r>
         <w:rPr>
@@ -1305,7 +1372,40 @@
         <w:t>pyspark</w:t>
       </w:r>
       <w:r>
-        <w:t xml:space="preserve"> installs cleanly but requires a Java runtime, and there is no JVM on my build machine. Section 13 permits "PySpark or Dask", so I planned module 7 around Dask. I expected </w:t>
+        <w:t xml:space="preserve"> installs cleanly but requires a Java runtime, and there is no JVM on my build machine. My plan allowed "PySpark or Dask", so I planned module 7 around Dask. I also dropped </w:t>
+      </w:r>
+      <w:r>
+        <w:rPr>
+          <w:rFonts w:ascii="Consolas" w:hAnsi="Consolas"/>
+          <w:color w:val="0E7C86"/>
+          <w:sz w:val="19"/>
+        </w:rPr>
+        <w:t>plotly</w:t>
+      </w:r>
+      <w:r>
+        <w:t xml:space="preserve">, because every figure is matplotlib and the dashboard is Power BI, and </w:t>
+      </w:r>
+      <w:r>
+        <w:rPr>
+          <w:rFonts w:ascii="Consolas" w:hAnsi="Consolas"/>
+          <w:color w:val="0E7C86"/>
+          <w:sz w:val="19"/>
+        </w:rPr>
+        <w:t>nltk</w:t>
+      </w:r>
+      <w:r>
+        <w:t xml:space="preserve">, because the </w:t>
+      </w:r>
+      <w:r>
+        <w:rPr>
+          <w:rFonts w:ascii="Consolas" w:hAnsi="Consolas"/>
+          <w:color w:val="0E7C86"/>
+          <w:sz w:val="19"/>
+        </w:rPr>
+        <w:t>vaderSentiment</w:t>
+      </w:r>
+      <w:r>
+        <w:t xml:space="preserve"> package does the tone scoring on its own. I expected </w:t>
       </w:r>
       <w:r>
         <w:rPr>
@@ -1335,18 +1435,17 @@
         <w:t xml:space="preserve"> in config, and every script that needs a seed reads it from there.</w:t>
       </w:r>
     </w:p>
-    <w:p/>
     <w:p>
       <w:pPr>
-        <w:pStyle w:val="Heading2"/>
+        <w:pStyle w:val="Heading3"/>
       </w:pPr>
       <w:r>
-        <w:t>2. Corrections to the brief's assumptions</w:t>
+        <w:t>2. Corrections to my first assumptions</w:t>
       </w:r>
     </w:p>
     <w:p>
       <w:r>
-        <w:t>I found four things in the brief to be wrong when I checked them against the live sources. I record each here because each would have cost me time or silently corrupted a result.</w:t>
+        <w:t>I found four things in my first plan to be wrong when I checked them against the live sources. I record each here because each would have cost me time or silently corrupted a result.</w:t>
       </w:r>
     </w:p>
     <w:p>
@@ -1379,7 +1478,7 @@
         <w:t>/v1/books/&lt;slug&gt;/chapters</w:t>
       </w:r>
       <w:r>
-        <w:t>, so I collect them that way. The appendix's warning that chapter records carry no character list is correct, which is why I build the module 3.2 network from attention instead.</w:t>
+        <w:t>, so I collect them that way. My early note that chapter records carry no character list was correct, which is why I build the module 3.2 network from attention instead.</w:t>
       </w:r>
     </w:p>
     <w:p>
@@ -1390,7 +1489,7 @@
         <w:t>Google Trends returns monthly data for long windows.</w:t>
       </w:r>
       <w:r>
-        <w:t xml:space="preserve"> The brief asks for weekly search interest since 2004. Google chooses granularity from the width of the request and gives the caller no say: a request spanning 2004 to 2026 returned 273 monthly points. So I collect the series twice, as a full-range monthly pull for the long history and as eight overlapping four-year windows for weekly detail, which I then rescale onto one series using their shared year.</w:t>
+        <w:t xml:space="preserve"> I planned to use weekly search interest since 2004. Google chooses granularity from the width of the request and gives the caller no say: a request spanning 2004 to 2026 returned 273 monthly points. So I collect the series twice, as a full range monthly pull for the long history and as eight overlapping four year windows for weekly detail, which I then rescale onto one series using their shared year.</w:t>
       </w:r>
     </w:p>
     <w:p>
@@ -1401,7 +1500,7 @@
         <w:t>The archived StatCan table uses a different classification.</w:t>
       </w:r>
       <w:r>
-        <w:t xml:space="preserve"> The brief's appendix flags that table 20-10-0008 is archived, which is true; it ends in December 2022. The larger problem is underneath: the archived table is coded to NAICS 2017 and the active table to NAICS 2022, and the 2022 revision renumbered the category this project is about from 451 to 459A. Concatenating on the code alone leaves the focus category with no history before 2017, silently, while total retail trade looks fine because its code never changed. I wrote a crosswalk in config mapping the old codes to the new ones, and my overlap check then measures how well each mapped pair agrees. 459A agrees with 451 to within 1.3% across 72 overlapping months.</w:t>
+        <w:t xml:space="preserve"> I knew from the start that table 20-10-0008 is archived. It ends in December 2022. The larger problem is underneath: the archived table is coded to NAICS 2017 and the active table to NAICS 2022, and the 2022 revision renumbered the category this project is about from 451 to 459A. Concatenating on the code alone leaves the focus category with no history before 2017, silently, while total retail trade looks fine because its code never changed. I wrote a crosswalk in config mapping the old codes to the new ones, and my overlap check then measures how well each mapped pair agrees. 459A agrees with 451 to within 1.3% across 72 overlapping months.</w:t>
       </w:r>
     </w:p>
     <w:p>
@@ -1412,7 +1511,7 @@
         <w:t>PotterDB's film financials cannot be trusted.</w:t>
       </w:r>
       <w:r>
-        <w:t xml:space="preserve"> Philosopher's Stone is listed at "$1.018 million" and Deathly Hallows Part 2 at "$1,342 billion"; Prisoner of Azkaban repeats the Chamber of Secrets release date. Three of these would survive a careless parse. So I hand-entered film money from The Numbers, Box Office Mojo and Rotten Tomatoes, keeping PotterDB's own figures alongside under a </w:t>
+        <w:t xml:space="preserve"> Philosopher's Stone is listed at "$1.018 million" and Deathly Hallows Part 2 at "$1,342 billion"; Prisoner of Azkaban repeats the Chamber of Secrets release date. Three of these would survive a careless parse. So I hand entered film money from The Numbers, Box Office Mojo and Rotten Tomatoes, keeping PotterDB's own figures alongside under a </w:t>
       </w:r>
       <w:r>
         <w:rPr>
@@ -1427,18 +1526,19 @@
       </w:r>
       <w:r>
         <w:rPr>
+          <w:rFonts w:ascii="Consolas" w:hAnsi="Consolas"/>
           <w:color w:val="0E7C86"/>
+          <w:sz w:val="19"/>
         </w:rPr>
-        <w:t>`data/external/films_notes.md`</w:t>
+        <w:t>data/external/films_notes.md</w:t>
       </w:r>
       <w:r>
         <w:t>.</w:t>
       </w:r>
     </w:p>
-    <w:p/>
     <w:p>
       <w:pPr>
-        <w:pStyle w:val="Heading2"/>
+        <w:pStyle w:val="Heading3"/>
       </w:pPr>
       <w:r>
         <w:t>3. Data sources and substitutions</w:t>
@@ -1699,7 +1799,7 @@
               <w:rPr>
                 <w:sz w:val="18"/>
               </w:rPr>
-              <w:t>144,035 article-days, daily 2015-07-01 to 2026-09-01, 37 articles</w:t>
+              <w:t>144,035 article days, daily 2015-07-01 to 2026-09-01, 37 articles</w:t>
             </w:r>
           </w:p>
         </w:tc>
@@ -1829,7 +1929,7 @@
               <w:rPr>
                 <w:sz w:val="18"/>
               </w:rPr>
-              <w:t>3 tables, 1.37m rows, retail 1991-2026 and CPI 1914-2026</w:t>
+              <w:t>3 tables, 222,799 rows, retail 1991-2026 and CPI 1914-2026</w:t>
             </w:r>
           </w:p>
         </w:tc>
@@ -2035,16 +2135,60 @@
     <w:p/>
     <w:p>
       <w:r>
-        <w:t xml:space="preserve">I hand-entered 11 films and 66 park-years, sourcing and dating every row, and validated both with </w:t>
+        <w:t xml:space="preserve">I hand entered 11 films and 66 park years, sourcing and dating every row, and validated both with </w:t>
       </w:r>
       <w:r>
         <w:rPr>
+          <w:rFonts w:ascii="Consolas" w:hAnsi="Consolas"/>
           <w:color w:val="0E7C86"/>
+          <w:sz w:val="19"/>
         </w:rPr>
-        <w:t>`09_external_check.py`</w:t>
+        <w:t>09_external_check.py</w:t>
       </w:r>
       <w:r>
         <w:t>.</w:t>
+      </w:r>
+    </w:p>
+    <w:p>
+      <w:pPr>
+        <w:pStyle w:val="Heading4"/>
+      </w:pPr>
+      <w:r>
+        <w:t>What the two missing sources cost</w:t>
+      </w:r>
+    </w:p>
+    <w:p>
+      <w:r>
+        <w:t xml:space="preserve">Six analyses could not run the way I first planned them: 3.1, 3.4, 4, 5.3, 5.4 and 7. I did not scrape around either source, and my reasoning is in </w:t>
+      </w:r>
+      <w:r>
+        <w:rPr>
+          <w:rFonts w:ascii="Consolas" w:hAnsi="Consolas"/>
+          <w:color w:val="0E7C86"/>
+          <w:sz w:val="19"/>
+        </w:rPr>
+        <w:t>ethics.md</w:t>
+      </w:r>
+      <w:r>
+        <w:t xml:space="preserve"> section 1. Instead I replaced each one with an analysis I could run on the data I had. Section 3b lists every replacement.</w:t>
+      </w:r>
+    </w:p>
+    <w:p>
+      <w:pPr>
+        <w:pStyle w:val="Heading4"/>
+      </w:pPr>
+      <w:r>
+        <w:t>Attention series substitution</w:t>
+      </w:r>
+    </w:p>
+    <w:p>
+      <w:r>
+        <w:t>My fallback plan was for pageviews to become the primary attention series if search interest failed, with the analysis start moving from 2004 to 2015. Search interest did not fail, but I use pageviews as the primary series anyway, for a different reason: pageviews are actual counts on a stable definition, while I had to stitch the weekly Trends series across eight independently normalised windows. I retain Trends as an independent second series and for the Canadian and regional cuts, which pageviews cannot provide.</w:t>
+      </w:r>
+    </w:p>
+    <w:p>
+      <w:r>
+        <w:t>The practical effect is that my analysis window is 2015 onward for anything resting on the attention series, and 1991 onward for anything resting on retail.</w:t>
       </w:r>
     </w:p>
     <w:p>
@@ -2052,53 +2196,12 @@
         <w:pStyle w:val="Heading3"/>
       </w:pPr>
       <w:r>
-        <w:t>What the two missing sources cost</w:t>
+        <w:t>3b. Where the analysis substitutes for what I first planned</w:t>
       </w:r>
     </w:p>
     <w:p>
       <w:r>
-        <w:t xml:space="preserve">Four analyses could not run: sentiment over time (3.1), the licensing premium test (3.4), audience segmentation (4) and the big data comparison (7). I used no workaround; my reasoning is in </w:t>
-      </w:r>
-      <w:r>
-        <w:rPr>
-          <w:color w:val="0E7C86"/>
-        </w:rPr>
-        <w:t>`ethics.md`</w:t>
-      </w:r>
-      <w:r>
-        <w:t xml:space="preserve"> section 1.</w:t>
-      </w:r>
-    </w:p>
-    <w:p>
-      <w:pPr>
-        <w:pStyle w:val="Heading3"/>
-      </w:pPr>
-      <w:r>
-        <w:t>Attention series substitution</w:t>
-      </w:r>
-    </w:p>
-    <w:p>
-      <w:r>
-        <w:t>Section 6 provides for pageviews becoming the primary attention series if search interest fails, with the analysis start moving from 2004 to 2015. Search interest did not fail, but I use pageviews as the primary series anyway, for a different reason: pageviews are actual counts on a stable definition, while I had to stitch the weekly Trends series across eight independently-normalised windows. I retain Trends as an independent second series and for the Canadian and regional cuts, which pageviews cannot provide.</w:t>
-      </w:r>
-    </w:p>
-    <w:p>
-      <w:r>
-        <w:t>The practical effect is that my analysis window is 2015 onward for anything resting on the attention series, and 1991 onward for anything resting on retail.</w:t>
-      </w:r>
-    </w:p>
-    <w:p/>
-    <w:p>
-      <w:pPr>
-        <w:pStyle w:val="Heading2"/>
-      </w:pPr>
-      <w:r>
-        <w:t>3b. Where the analysis substitutes for what the brief asked</w:t>
-      </w:r>
-    </w:p>
-    <w:p>
-      <w:r>
-        <w:t>I could not run six analyses as specified, because they need fan text or retail prices that no credential-free source provides. I replaced each rather than skipping it, and I label each replacement as one wherever it appears.</w:t>
+        <w:t>I could not run six analyses as planned, because they need fan text or retail prices that no credential free source provides. I replaced each rather than skipping it, and I label each replacement as one wherever it appears.</w:t>
       </w:r>
     </w:p>
     <w:tbl>
@@ -2126,7 +2229,7 @@
                 <w:b/>
                 <w:sz w:val="18"/>
               </w:rPr>
-              <w:t>Brief asks for</w:t>
+              <w:t>What I first planned</w:t>
             </w:r>
           </w:p>
         </w:tc>
@@ -2566,7 +2669,7 @@
         <w:t>Module 4 is not audience segmentation and no amount of method fixes that.</w:t>
       </w:r>
       <w:r>
-        <w:t xml:space="preserve"> Segmenting people needs data about people. I do not attempt the generation comparison the brief also asks for.</w:t>
+        <w:t xml:space="preserve"> Segmenting people needs data about people. I do not attempt the generation comparison I had also planned.</w:t>
       </w:r>
     </w:p>
     <w:p>
@@ -2591,10 +2694,9 @@
         <w:t>.</w:t>
       </w:r>
     </w:p>
-    <w:p/>
     <w:p>
       <w:pPr>
-        <w:pStyle w:val="Heading2"/>
+        <w:pStyle w:val="Heading3"/>
       </w:pPr>
       <w:r>
         <w:t>4. Money</w:t>
@@ -2608,7 +2710,7 @@
         <w:t>Currency.</w:t>
       </w:r>
       <w:r>
-        <w:t xml:space="preserve"> Canadian dollars throughout, per section 20.</w:t>
+        <w:t xml:space="preserve"> Canadian dollars throughout, because the client is Canadian.</w:t>
       </w:r>
     </w:p>
     <w:p>
@@ -2634,9 +2736,11 @@
       </w:r>
       <w:r>
         <w:rPr>
+          <w:rFonts w:ascii="Consolas" w:hAnsi="Consolas"/>
           <w:color w:val="0E7C86"/>
+          <w:sz w:val="19"/>
         </w:rPr>
-        <w:t>`17_clean_external.py`</w:t>
+        <w:t>17_clean_external.py</w:t>
       </w:r>
       <w:r>
         <w:t>. I use a single rate rather than a historic series deliberately: a historic series would mix two distinct effects, inflation and currency movement, inside one column, and the reader could not tell which was which.</w:t>
@@ -2686,10 +2790,9 @@
         <w:t xml:space="preserve"> Deflating US box office by Canadian CPI measures what those takings would be worth to a Canadian buyer today. It is not the US real box office and must not be described as such.</w:t>
       </w:r>
     </w:p>
-    <w:p/>
     <w:p>
       <w:pPr>
-        <w:pStyle w:val="Heading2"/>
+        <w:pStyle w:val="Heading3"/>
       </w:pPr>
       <w:r>
         <w:t>5. Modelling choices</w:t>
@@ -2714,7 +2817,7 @@
         <w:t>I report every model against a baseline.</w:t>
       </w:r>
       <w:r>
-        <w:t xml:space="preserve"> For the forecast that baseline is a seasonal naive; for the interest-to-sales regression it is the same specification with the attention term removed.</w:t>
+        <w:t xml:space="preserve"> For the forecast that baseline is a seasonal naive; for the interest to sales regression it is the same specification with the attention term removed.</w:t>
       </w:r>
     </w:p>
     <w:p>
@@ -2744,7 +2847,7 @@
         <w:rPr>
           <w:b/>
         </w:rPr>
-        <w:t>Week-on-week differences before correlating.</w:t>
+        <w:t>Week on week differences before correlating.</w:t>
       </w:r>
       <w:r>
         <w:t xml:space="preserve"> Every character article shares the franchise trend. On raw levels every pair correlates above 0.9 and the network measures nothing but that trend.</w:t>
@@ -2769,7 +2872,7 @@
         <w:t>I treat the eleven film rows as descriptive only.</w:t>
       </w:r>
       <w:r>
-        <w:t xml:space="preserve"> That is section 18's rule and I keep to it throughout. I fit no predictive model to them.</w:t>
+        <w:t xml:space="preserve"> That is a rule I set at the start and I keep to it throughout. I fit no predictive model to them.</w:t>
       </w:r>
     </w:p>
     <w:p>
@@ -2803,10 +2906,9 @@
         <w:t>, and I never describe them as such.</w:t>
       </w:r>
     </w:p>
-    <w:p/>
     <w:p>
       <w:pPr>
-        <w:pStyle w:val="Heading2"/>
+        <w:pStyle w:val="Heading3"/>
       </w:pPr>
       <w:r>
         <w:t>6. Every assumption, in one table</w:t>
@@ -2814,13 +2916,15 @@
     </w:p>
     <w:p>
       <w:r>
-        <w:t xml:space="preserve">I keep a machine-readable copy at </w:t>
+        <w:t xml:space="preserve">I keep a machine readable copy at </w:t>
       </w:r>
       <w:r>
         <w:rPr>
+          <w:rFonts w:ascii="Consolas" w:hAnsi="Consolas"/>
           <w:color w:val="0E7C86"/>
+          <w:sz w:val="19"/>
         </w:rPr>
-        <w:t>`outputs/tables/retail_assumptions.csv`</w:t>
+        <w:t>outputs/tables/retail_assumptions.csv</w:t>
       </w:r>
       <w:r>
         <w:t>, which module 6 generates so it cannot drift from what my code used.</w:t>
@@ -2985,7 +3089,7 @@
               <w:rPr>
                 <w:sz w:val="18"/>
               </w:rPr>
-              <w:t>Section 20; client is Canadian</w:t>
+              <w:t>My default; client is Canadian</w:t>
             </w:r>
           </w:p>
         </w:tc>
@@ -3182,10 +3286,9 @@
             </w:r>
             <w:r>
               <w:rPr>
-                <w:b/>
-                <w:sz w:val="18"/>
-              </w:rPr>
-              <w:t>Attention to sales pass-through</w:t>
+                <w:sz w:val="18"/>
+              </w:rPr>
+              <w:t>Attention to sales pass through</w:t>
             </w:r>
           </w:p>
         </w:tc>
@@ -3204,7 +3307,6 @@
             </w:r>
             <w:r>
               <w:rPr>
-                <w:b/>
                 <w:sz w:val="18"/>
               </w:rPr>
               <w:t>0.35</w:t>
@@ -3249,7 +3351,6 @@
             </w:r>
             <w:r>
               <w:rPr>
-                <w:b/>
                 <w:sz w:val="18"/>
               </w:rPr>
               <w:t>Module 5.2 could not measure it. Largest single uncertainty in the project.</w:t>
@@ -3780,7 +3881,7 @@
               <w:rPr>
                 <w:sz w:val="18"/>
               </w:rPr>
-              <w:t>Section 20 default, reserved for a human</w:t>
+              <w:t>My default, to be confirmed with the retailer</w:t>
             </w:r>
           </w:p>
         </w:tc>
@@ -4567,7 +4668,7 @@
     <w:p/>
     <w:p>
       <w:pPr>
-        <w:pStyle w:val="Heading3"/>
+        <w:pStyle w:val="Heading4"/>
       </w:pPr>
       <w:r>
         <w:t>The assumption to argue with first</w:t>
@@ -4583,16 +4684,18 @@
         <w:t>attention_pass_through</w:t>
       </w:r>
       <w:r>
-        <w:t xml:space="preserve">. In module 5.2 I tried to measure it and got an elasticity of 0.051 with a confidence interval spanning zero (p = 0.071), because NAICS 459A contains every bookshop and hobby shop in Canada and one franchise inside it sits below the noise floor. Rather than present a non-significant coefficient as a measurement, I declare the conversion as an assumption and report the recommendation across a range of it in </w:t>
+        <w:t xml:space="preserve">. In module 5.2 I tried to measure it and got an elasticity of 0.051 with a confidence interval spanning zero (p = 0.071), because NAICS 459A contains every bookshop and hobby shop in Canada and one franchise inside it sits below the noise floor. Rather than present a not significant coefficient as a measurement, I declare the conversion as an assumption and report the recommendation across a range of it in </w:t>
       </w:r>
       <w:r>
         <w:rPr>
+          <w:rFonts w:ascii="Consolas" w:hAnsi="Consolas"/>
           <w:color w:val="0E7C86"/>
+          <w:sz w:val="19"/>
         </w:rPr>
-        <w:t>`outputs/tables/retail_sensitivity.csv`</w:t>
-      </w:r>
-      <w:r>
-        <w:t>. Across the range 0.15 to 0.70 the central season runs from $1.99m to $2.53m, a spread wider than the gap between my low and high demand scenarios.</w:t>
+        <w:t>outputs/tables/retail_sensitivity.csv</w:t>
+      </w:r>
+      <w:r>
+        <w:t>. Across the range 0.15 to 0.70 the central season runs from $1.99m to $2.53m, a spread of $0.54m against a gap of $0.66m between my low and high demand scenarios.</w:t>
       </w:r>
     </w:p>
     <w:p>
@@ -4600,10 +4703,9 @@
         <w:t>If you are reviewing this work, start here.</w:t>
       </w:r>
     </w:p>
-    <w:p/>
     <w:p>
       <w:pPr>
-        <w:pStyle w:val="Heading2"/>
+        <w:pStyle w:val="Heading3"/>
       </w:pPr>
       <w:r>
         <w:t>7. Reproducing the build</w:t>
@@ -4611,7 +4713,7 @@
     </w:p>
     <w:p>
       <w:r>
-        <w:t>I number the scripts so that filename order is run order.</w:t>
+        <w:t>I number the scripts so that filename order is run order. The one exception is that 24_web_export.py and 28_infographic.py read tables made by the models and retail scripts, so I run those two again at the end, and the report script goes last.</w:t>
       </w:r>
     </w:p>
     <w:p>
@@ -4626,6 +4728,41 @@
           <w:sz w:val="18"/>
         </w:rPr>
         <w:t>python -m pip install -r requirements.txt</w:t>
+        <w:br/>
+        <w:t>for f in src/collect/*.py src/clean/*.py src/analysis/*.py src/models/*.py src/retail/*.py src/bigdata/*.py; do python "$f"; done</w:t>
+        <w:br/>
+        <w:t>python src/analysis/24_web_export.py</w:t>
+        <w:br/>
+        <w:t>python src/analysis/28_infographic.py</w:t>
+        <w:br/>
+        <w:t>python src/report/60_build_report.py</w:t>
+      </w:r>
+    </w:p>
+    <w:p>
+      <w:r>
+        <w:t xml:space="preserve">Collection takes about 20 minutes, almost all of it deliberate rate limit waiting; the rest of the build takes about 3 minutes. Deleting </w:t>
+      </w:r>
+      <w:r>
+        <w:rPr>
+          <w:rFonts w:ascii="Consolas" w:hAnsi="Consolas"/>
+          <w:color w:val="0E7C86"/>
+          <w:sz w:val="19"/>
+        </w:rPr>
+        <w:t>data/</w:t>
+      </w:r>
+      <w:r>
+        <w:t xml:space="preserve"> entirely and rerunning rebuilds every cleaned and processed table, apart from the two hand entered files in </w:t>
+      </w:r>
+      <w:r>
+        <w:rPr>
+          <w:rFonts w:ascii="Consolas" w:hAnsi="Consolas"/>
+          <w:color w:val="0E7C86"/>
+          <w:sz w:val="19"/>
+        </w:rPr>
+        <w:t>data/external</w:t>
+      </w:r>
+      <w:r>
+        <w:t>, which no script can regenerate.</w:t>
       </w:r>
     </w:p>
     <w:p>
@@ -4639,12 +4776,73 @@
           <w:color w:val="5F7A80"/>
           <w:sz w:val="18"/>
         </w:rPr>
-        <w:t>for f in src/collect/*.py src/clean/*.py src/analysis/*.py src/models/*.py src/retail/*.py src/bigdata/*.py src/report/*.py; do python "$f"; done</w:t>
+        <w:t>python -m pytest tests/ -q</w:t>
+        <w:br/>
+        <w:t>python -m ruff check src/ tests/</w:t>
       </w:r>
     </w:p>
     <w:p>
-      <w:r>
-        <w:t xml:space="preserve">Collection takes about 20 minutes, almost all of it deliberate rate-limit waiting; the rest of the build takes about 3 minutes. Deleting </w:t>
+      <w:pPr>
+        <w:pStyle w:val="Heading3"/>
+      </w:pPr>
+      <w:r>
+        <w:t>8. Known weaknesses</w:t>
+      </w:r>
+    </w:p>
+    <w:p>
+      <w:r>
+        <w:t>I rank these by how much they threaten my recommendation.</w:t>
+      </w:r>
+    </w:p>
+    <w:p>
+      <w:pPr>
+        <w:pStyle w:val="ListNumber"/>
+      </w:pPr>
+      <w:r>
+        <w:rPr>
+          <w:b/>
+        </w:rPr>
+        <w:t>The pass through assumption is unmeasured.</w:t>
+      </w:r>
+      <w:r>
+        <w:t xml:space="preserve"> Section 6 above.</w:t>
+      </w:r>
+    </w:p>
+    <w:p>
+      <w:pPr>
+        <w:pStyle w:val="ListNumber"/>
+      </w:pPr>
+      <w:r>
+        <w:rPr>
+          <w:b/>
+        </w:rPr>
+        <w:t>The category baseline is stated, not observed.</w:t>
+      </w:r>
+      <w:r>
+        <w:t xml:space="preserve"> I had no retailer's internal sales, so the absolute size of my recommendation is only as good as that figure. The </w:t>
+      </w:r>
+      <w:r>
+        <w:rPr>
+          <w:i/>
+        </w:rPr>
+        <w:t>shape</w:t>
+      </w:r>
+      <w:r>
+        <w:t xml:space="preserve"> of the recommendation, meaning the January split, the order dates and the relative scenario spread, does not depend on it.</w:t>
+      </w:r>
+    </w:p>
+    <w:p>
+      <w:pPr>
+        <w:pStyle w:val="ListNumber"/>
+      </w:pPr>
+      <w:r>
+        <w:rPr>
+          <w:b/>
+        </w:rPr>
+        <w:t>Brand risk is unquantified.</w:t>
+      </w:r>
+      <w:r>
+        <w:t xml:space="preserve"> I collected no sentiment data, so the downside from public controversy is a known unknown. See </w:t>
       </w:r>
       <w:r>
         <w:rPr>
@@ -4652,10 +4850,100 @@
           <w:color w:val="0E7C86"/>
           <w:sz w:val="19"/>
         </w:rPr>
-        <w:t>data/</w:t>
-      </w:r>
-      <w:r>
-        <w:t xml:space="preserve"> entirely and rerunning rebuilds every cleaned and processed table, apart from the two hand-entered files in </w:t>
+        <w:t>ethics.md</w:t>
+      </w:r>
+      <w:r>
+        <w:t xml:space="preserve"> section 5.</w:t>
+      </w:r>
+    </w:p>
+    <w:p>
+      <w:pPr>
+        <w:pStyle w:val="ListNumber"/>
+      </w:pPr>
+      <w:r>
+        <w:rPr>
+          <w:b/>
+        </w:rPr>
+        <w:t>No streaming premiere exists in my event sample.</w:t>
+      </w:r>
+      <w:r>
+        <w:t xml:space="preserve"> The four events I measured are three cinema releases and one trailer. A premiere releasing eight episodes weekly has no analogue in the data.</w:t>
+      </w:r>
+    </w:p>
+    <w:p>
+      <w:pPr>
+        <w:pStyle w:val="ListNumber"/>
+      </w:pPr>
+      <w:r>
+        <w:rPr>
+          <w:b/>
+        </w:rPr>
+        <w:t>English language attention standing in for Canadian demand.</w:t>
+      </w:r>
+      <w:r>
+        <w:t xml:space="preserve"> This underweights Quebec, which matters for a Canadian retailer.</w:t>
+      </w:r>
+    </w:p>
+    <w:p>
+      <w:pPr>
+        <w:pStyle w:val="ListNumber"/>
+      </w:pPr>
+      <w:r>
+        <w:rPr>
+          <w:b/>
+        </w:rPr>
+        <w:t>Three of six order by dates have already passed</w:t>
+      </w:r>
+      <w:r>
+        <w:t xml:space="preserve"> as of my analysis date of 2 September 2026, including imported product for the January position. That is a finding about timing, not a defect in the analysis, but it constrains what the retailer can now act on.</w:t>
+      </w:r>
+    </w:p>
+    <w:p>
+      <w:r>
+        <w:br w:type="page"/>
+      </w:r>
+    </w:p>
+    <w:p>
+      <w:pPr>
+        <w:pStyle w:val="Heading1"/>
+      </w:pPr>
+      <w:r>
+        <w:rPr>
+          <w:color w:val="0E7C86"/>
+        </w:rPr>
+        <w:t>Ethics, security and trust</w:t>
+      </w:r>
+    </w:p>
+    <w:p>
+      <w:r>
+        <w:rPr>
+          <w:i/>
+          <w:sz w:val="19"/>
+        </w:rPr>
+        <w:t>How I obtained, protected and interpreted the data.</w:t>
+      </w:r>
+    </w:p>
+    <w:p>
+      <w:r>
+        <w:t>How I obtained, protected and interpreted the data in this project. I cover seven topics here, and I answer each one for this project and not in general terms, so each section below names the source, the script and the line of the build it applies to.</w:t>
+      </w:r>
+    </w:p>
+    <w:p>
+      <w:r>
+        <w:t>I wrote this after finishing the collection and analysis, so it describes what I actually did rather than what I intended.</w:t>
+      </w:r>
+    </w:p>
+    <w:p>
+      <w:pPr>
+        <w:pStyle w:val="Heading3"/>
+      </w:pPr>
+      <w:r>
+        <w:t>1. Terms of use</w:t>
+      </w:r>
+    </w:p>
+    <w:p>
+      <w:r>
+        <w:t xml:space="preserve">Before collecting anything I checked each source for whether automated access is permitted, what rate limit applies, and what identification the operator asks for. I route every outbound request in this project through one client, </w:t>
       </w:r>
       <w:r>
         <w:rPr>
@@ -4663,223 +4951,7 @@
           <w:color w:val="0E7C86"/>
           <w:sz w:val="19"/>
         </w:rPr>
-        <w:t>data/external</w:t>
-      </w:r>
-      <w:r>
-        <w:t>, which no script can regenerate.</w:t>
-      </w:r>
-    </w:p>
-    <w:p>
-      <w:pPr>
-        <w:spacing w:before="80"/>
-        <w:ind w:left="360"/>
-      </w:pPr>
-      <w:r>
-        <w:rPr>
-          <w:rFonts w:ascii="Consolas" w:hAnsi="Consolas"/>
-          <w:color w:val="5F7A80"/>
-          <w:sz w:val="18"/>
-        </w:rPr>
-        <w:t>python -m pytest tests/ -q</w:t>
-      </w:r>
-    </w:p>
-    <w:p>
-      <w:pPr>
-        <w:spacing w:before="80"/>
-        <w:ind w:left="360"/>
-      </w:pPr>
-      <w:r>
-        <w:rPr>
-          <w:rFonts w:ascii="Consolas" w:hAnsi="Consolas"/>
-          <w:color w:val="5F7A80"/>
-          <w:sz w:val="18"/>
-        </w:rPr>
-        <w:t>python -m ruff check src/ tests/</w:t>
-      </w:r>
-    </w:p>
-    <w:p/>
-    <w:p>
-      <w:pPr>
-        <w:pStyle w:val="Heading2"/>
-      </w:pPr>
-      <w:r>
-        <w:t>8. Known weaknesses</w:t>
-      </w:r>
-    </w:p>
-    <w:p>
-      <w:r>
-        <w:t>I rank these by how much they threaten my recommendation.</w:t>
-      </w:r>
-    </w:p>
-    <w:p>
-      <w:pPr>
-        <w:pStyle w:val="ListNumber"/>
-      </w:pPr>
-      <w:r>
-        <w:rPr>
-          <w:b/>
-        </w:rPr>
-        <w:t>The pass-through assumption is unmeasured.</w:t>
-      </w:r>
-      <w:r>
-        <w:t xml:space="preserve"> Section 6 above.</w:t>
-      </w:r>
-    </w:p>
-    <w:p>
-      <w:pPr>
-        <w:pStyle w:val="ListNumber"/>
-      </w:pPr>
-      <w:r>
-        <w:rPr>
-          <w:b/>
-        </w:rPr>
-        <w:t>The category baseline is stated, not observed.</w:t>
-      </w:r>
-      <w:r>
-        <w:t xml:space="preserve"> I had no retailer's</w:t>
-      </w:r>
-    </w:p>
-    <w:p>
-      <w:r>
-        <w:t xml:space="preserve">internal sales, so the absolute size of my recommendation is only as good as that figure. The </w:t>
-      </w:r>
-      <w:r>
-        <w:rPr>
-          <w:i/>
-        </w:rPr>
-        <w:t>shape</w:t>
-      </w:r>
-      <w:r>
-        <w:t xml:space="preserve"> of the recommendation — the January split, the order dates, the relative scenario spread — does not depend on it.</w:t>
-      </w:r>
-    </w:p>
-    <w:p>
-      <w:pPr>
-        <w:pStyle w:val="ListNumber"/>
-      </w:pPr>
-      <w:r>
-        <w:rPr>
-          <w:b/>
-        </w:rPr>
-        <w:t>Brand risk is unquantified.</w:t>
-      </w:r>
-      <w:r>
-        <w:t xml:space="preserve"> I collected no sentiment data, so the downside</w:t>
-      </w:r>
-    </w:p>
-    <w:p>
-      <w:r>
-        <w:t xml:space="preserve">from public controversy is a known unknown. See </w:t>
-      </w:r>
-      <w:r>
-        <w:rPr>
-          <w:color w:val="0E7C86"/>
-        </w:rPr>
-        <w:t>`ethics.md`</w:t>
-      </w:r>
-      <w:r>
-        <w:t xml:space="preserve"> section 5.</w:t>
-      </w:r>
-    </w:p>
-    <w:p>
-      <w:pPr>
-        <w:pStyle w:val="ListNumber"/>
-      </w:pPr>
-      <w:r>
-        <w:rPr>
-          <w:b/>
-        </w:rPr>
-        <w:t>No streaming premiere exists in my event sample.</w:t>
-      </w:r>
-      <w:r>
-        <w:t xml:space="preserve"> The four events I</w:t>
-      </w:r>
-    </w:p>
-    <w:p>
-      <w:r>
-        <w:t>measured are three cinema releases and one trailer. A premiere releasing eight episodes weekly has no analogue in the data.</w:t>
-      </w:r>
-    </w:p>
-    <w:p>
-      <w:pPr>
-        <w:pStyle w:val="ListNumber"/>
-      </w:pPr>
-      <w:r>
-        <w:rPr>
-          <w:b/>
-        </w:rPr>
-        <w:t>English-language attention standing in for Canadian demand.</w:t>
-      </w:r>
-      <w:r>
-        <w:t xml:space="preserve"> This</w:t>
-      </w:r>
-    </w:p>
-    <w:p>
-      <w:r>
-        <w:t>under-weights Quebec, which matters for a Canadian retailer.</w:t>
-      </w:r>
-    </w:p>
-    <w:p>
-      <w:pPr>
-        <w:pStyle w:val="ListNumber"/>
-      </w:pPr>
-      <w:r>
-        <w:rPr>
-          <w:b/>
-        </w:rPr>
-        <w:t>Three of six order-by dates have already passed</w:t>
-      </w:r>
-      <w:r>
-        <w:t xml:space="preserve"> as of my analysis date of</w:t>
-      </w:r>
-    </w:p>
-    <w:p>
-      <w:r>
-        <w:t>2 September 2026, including imported product for the January position. That is a finding about timing, not a defect in the analysis, but it constrains what the retailer can now act on.</w:t>
-      </w:r>
-    </w:p>
-    <w:p>
-      <w:r>
-        <w:br w:type="page"/>
-      </w:r>
-    </w:p>
-    <w:p>
-      <w:pPr>
-        <w:pStyle w:val="Heading1"/>
-      </w:pPr>
-      <w:r>
-        <w:rPr>
-          <w:color w:val="0E7C86"/>
-        </w:rPr>
-        <w:t>Ethics, security and trust</w:t>
-      </w:r>
-    </w:p>
-    <w:p>
-      <w:r>
-        <w:rPr>
-          <w:i/>
-          <w:sz w:val="19"/>
-        </w:rPr>
-        <w:t>How I obtained, protected and interpreted the data.</w:t>
-      </w:r>
-    </w:p>
-    <w:p>
-      <w:pPr>
-        <w:pStyle w:val="Heading2"/>
-      </w:pPr>
-      <w:r>
-        <w:t>1. Terms of use</w:t>
-      </w:r>
-    </w:p>
-    <w:p>
-      <w:r>
-        <w:t xml:space="preserve">Before collecting anything I checked each source for whether automated access is permitted, what rate limit applies, and what identification the operator asks for. I route every outbound request in this project through one client, </w:t>
-      </w:r>
-      <w:r>
-        <w:rPr>
-          <w:color w:val="0E7C86"/>
-        </w:rPr>
-        <w:t>`src/utils/http.py`</w:t>
+        <w:t>src/utils/http.py</w:t>
       </w:r>
       <w:r>
         <w:t xml:space="preserve">, which sets a </w:t>
@@ -5447,7 +5519,7 @@
               <w:rPr>
                 <w:sz w:val="18"/>
               </w:rPr>
-              <w:t>I used the bulk table download rather than per-series calls: three requests instead of several thousand.</w:t>
+              <w:t>I used the bulk table download rather than per series calls: three requests instead of several thousand.</w:t>
             </w:r>
           </w:p>
         </w:tc>
@@ -5533,7 +5605,7 @@
               <w:rPr>
                 <w:sz w:val="18"/>
               </w:rPr>
-              <w:t>Four files. I did not use the keyed API, so no key was required and anyone cloning the repository can reproduce the source.</w:t>
+              <w:t>Five files. I did not use the keyed API, so no key was required and anyone cloning the repository can reproduce the source.</w:t>
             </w:r>
           </w:p>
         </w:tc>
@@ -5736,7 +5808,7 @@
     <w:p/>
     <w:p>
       <w:pPr>
-        <w:pStyle w:val="Heading3"/>
+        <w:pStyle w:val="Heading4"/>
       </w:pPr>
       <w:r>
         <w:t>The two sources I did not collect</w:t>
@@ -5752,12 +5824,7 @@
         <w:pStyle w:val="ListBullet"/>
       </w:pPr>
       <w:r>
-        <w:t>Brickset's set data is visible on its public web pages and I could have scraped</w:t>
-      </w:r>
-    </w:p>
-    <w:p>
-      <w:r>
-        <w:t>it.</w:t>
+        <w:t>Brickset's set data is visible on its public web pages and I could have scraped it.</w:t>
       </w:r>
     </w:p>
     <w:p>
@@ -5765,37 +5832,33 @@
         <w:pStyle w:val="ListBullet"/>
       </w:pPr>
       <w:r>
-        <w:t>Reddit exposes an undocumented JSON endpoint that returns post data without</w:t>
+        <w:t>Reddit exposes an undocumented JSON endpoint that returns post data without authentication.</w:t>
       </w:r>
     </w:p>
     <w:p>
       <w:r>
-        <w:t>authentication.</w:t>
+        <w:t xml:space="preserve">Scraping either would have produced the data. It would also have made every statement I make in this section false, because I would then have had to say that I collected two sources in a way their operators explicitly ask people not to. The cost of not scraping is that six analyses could not run the way I first planned them: 3.1, 3.4, 4, 5.3, 5.4 and 7. I replaced each with an analysis on data I could get without a key, and I label every replacement as one wherever it appears. I record that cost in </w:t>
+      </w:r>
+      <w:r>
+        <w:rPr>
+          <w:rFonts w:ascii="Consolas" w:hAnsi="Consolas"/>
+          <w:color w:val="0E7C86"/>
+          <w:sz w:val="19"/>
+        </w:rPr>
+        <w:t>open_questions.md</w:t>
+      </w:r>
+      <w:r>
+        <w:t xml:space="preserve"> and in the README rather than hiding it behind a gap in the analysis.</w:t>
       </w:r>
     </w:p>
     <w:p>
       <w:r>
-        <w:t xml:space="preserve">Scraping either would have produced the data. It would also have made every statement I make in this section false, because I would then have had to say that I collected two sources in a way their operators explicitly ask people not to. The cost of not scraping is that four analyses could not run: sentiment over time (3.1), the licensing premium test (3.4), audience segmentation (4) and the big data comparison (7). I record that cost in </w:t>
-      </w:r>
-      <w:r>
-        <w:rPr>
-          <w:color w:val="0E7C86"/>
-        </w:rPr>
-        <w:t>`docs/open_questions.md`</w:t>
-      </w:r>
-      <w:r>
-        <w:t xml:space="preserve"> and in the README rather than hiding it behind a gap in the analysis.</w:t>
+        <w:t>This is the clearest ethical decision I made in this project, and it was a real trade off rather than a costless one.</w:t>
       </w:r>
     </w:p>
     <w:p>
-      <w:r>
-        <w:t>This is the clearest ethical decision I made in this project, and it was a real trade-off rather than a costless one.</w:t>
-      </w:r>
-    </w:p>
-    <w:p/>
-    <w:p>
       <w:pPr>
-        <w:pStyle w:val="Heading2"/>
+        <w:pStyle w:val="Heading3"/>
       </w:pPr>
       <w:r>
         <w:t>2. Privacy of fan data</w:t>
@@ -5812,9 +5875,11 @@
       </w:r>
       <w:r>
         <w:rPr>
+          <w:rFonts w:ascii="Consolas" w:hAnsi="Consolas"/>
           <w:color w:val="0E7C86"/>
+          <w:sz w:val="19"/>
         </w:rPr>
-        <w:t>`src/collect/08_reddit.py`</w:t>
+        <w:t>src/collect/08_reddit.py</w:t>
       </w:r>
       <w:r>
         <w:t>, rather than applying them afterwards. That ordering is the point: a privacy rule applied after collection has already been broken once, because the raw file on disk already contains the thing the rule was meant to prevent.</w:t>
@@ -5831,12 +5896,7 @@
         <w:t>Usernames never reach disk.</w:t>
       </w:r>
       <w:r>
-        <w:t xml:space="preserve"> I replace each author at the moment of</w:t>
-      </w:r>
-    </w:p>
-    <w:p>
-      <w:r>
-        <w:t xml:space="preserve">collection with a salted SHA-256 hash truncated to 16 characters. The salt lives in </w:t>
+        <w:t xml:space="preserve"> I replace each author at the moment of collection with a salted SHA-256 hash truncated to 16 characters. The salt lives in </w:t>
       </w:r>
       <w:r>
         <w:rPr>
@@ -5847,7 +5907,7 @@
         <w:t>.env</w:t>
       </w:r>
       <w:r>
-        <w:t>, which is git-ignored, so nobody reading this repository can reverse the hashes. The hash exists only so that posts by the same person can be grouped into segmentation features; I never report it.</w:t>
+        <w:t>, which is ignored by git, so nobody reading this repository can reverse the hashes. The hash exists only so that posts by the same person can be grouped into segmentation features; I never report it.</w:t>
       </w:r>
     </w:p>
     <w:p>
@@ -5861,12 +5921,7 @@
         <w:t>Salted, not plain.</w:t>
       </w:r>
       <w:r>
-        <w:t xml:space="preserve"> A plain SHA-256 of a username is reversible in seconds</w:t>
-      </w:r>
-    </w:p>
-    <w:p>
-      <w:r>
-        <w:t>with a dictionary of known usernames. It would be personal data wearing a disguise.</w:t>
+        <w:t xml:space="preserve"> A plain SHA-256 of a username is reversible in seconds with a dictionary of known usernames. It would be personal data wearing a disguise.</w:t>
       </w:r>
     </w:p>
     <w:p>
@@ -5891,12 +5946,7 @@
         <w:t>post_record</w:t>
       </w:r>
       <w:r>
-        <w:t xml:space="preserve"> lists the fields it keeps.</w:t>
-      </w:r>
-    </w:p>
-    <w:p>
-      <w:r>
-        <w:t>Anything not on that list cannot reach the corpus, which is a stronger guarantee than deleting fields afterwards.</w:t>
+        <w:t xml:space="preserve"> lists the fields it keeps. Anything not on that list cannot reach the corpus, which is a stronger guarantee than deleting fields afterwards.</w:t>
       </w:r>
     </w:p>
     <w:p>
@@ -5910,12 +5960,7 @@
         <w:t>Account age, not account identity.</w:t>
       </w:r>
       <w:r>
-        <w:t xml:space="preserve"> Age band is a useful segmentation</w:t>
-      </w:r>
-    </w:p>
-    <w:p>
-      <w:r>
-        <w:t>feature; the account it belongs to is not. I store only the age in days at the time of posting.</w:t>
+        <w:t xml:space="preserve"> Age band is a useful segmentation feature; the account it belongs to is not. I store only the age in days at the time of posting.</w:t>
       </w:r>
     </w:p>
     <w:p>
@@ -5928,13 +5973,16 @@
         </w:rPr>
         <w:t>The cleaning step refuses to proceed on a violation.</w:t>
       </w:r>
-    </w:p>
-    <w:p>
+      <w:r>
+        <w:t xml:space="preserve"> </w:t>
+      </w:r>
       <w:r>
         <w:rPr>
+          <w:rFonts w:ascii="Consolas" w:hAnsi="Consolas"/>
           <w:color w:val="0E7C86"/>
+          <w:sz w:val="19"/>
         </w:rPr>
-        <w:t>`src/clean/16_clean_reddit.py`</w:t>
+        <w:t>src/clean/16_clean_reddit.py</w:t>
       </w:r>
       <w:r>
         <w:t xml:space="preserve"> raises and stops if a raw file contains an </w:t>
@@ -5973,12 +6021,7 @@
         <w:t>No individual is quoted.</w:t>
       </w:r>
       <w:r>
-        <w:t xml:space="preserve"> Nowhere in this repository, in any figure, table</w:t>
-      </w:r>
-    </w:p>
-    <w:p>
-      <w:r>
-        <w:t>or document, do I reproduce any individual user's post.</w:t>
+        <w:t xml:space="preserve"> Nowhere in this repository, in any figure, table or document, do I reproduce any individual user's post.</w:t>
       </w:r>
     </w:p>
     <w:p>
@@ -6013,10 +6056,8 @@
         </w:rPr>
         <w:t>config.yaml</w:t>
       </w:r>
-    </w:p>
-    <w:p>
-      <w:r>
-        <w:t>to 20; I would report no group smaller than that.</w:t>
+      <w:r>
+        <w:t xml:space="preserve"> to 20; I would report no group smaller than that.</w:t>
       </w:r>
     </w:p>
     <w:p>
@@ -6036,9 +6077,11 @@
       </w:r>
       <w:r>
         <w:rPr>
+          <w:rFonts w:ascii="Consolas" w:hAnsi="Consolas"/>
           <w:color w:val="0E7C86"/>
+          <w:sz w:val="19"/>
         </w:rPr>
-        <w:t>`tests/test_processed.py`</w:t>
+        <w:t>tests/test_processed.py</w:t>
       </w:r>
       <w:r>
         <w:t xml:space="preserve"> fails the build if any processed table gains a column named </w:t>
@@ -6088,10 +6131,9 @@
         <w:t xml:space="preserve"> I collected no fan text at all, so no personal data exists in this repository today. My controls above are real and tested, but they have not yet had to protect anything. If credentials are added later, they take effect before the first record is written.</w:t>
       </w:r>
     </w:p>
-    <w:p/>
     <w:p>
       <w:pPr>
-        <w:pStyle w:val="Heading2"/>
+        <w:pStyle w:val="Heading3"/>
       </w:pPr>
       <w:r>
         <w:t>3. Young audiences</w:t>
@@ -6110,7 +6152,7 @@
         <w:t>The obligations.</w:t>
       </w:r>
       <w:r>
-        <w:t xml:space="preserve"> In Canada, PIPEDA governs collection of personal information in the course of commercial activity, and the Office of the Privacy Commissioner has been explicit that consent from a child cannot be considered meaningful; consent must come from a parent or guardian. Quebec's Law 25 adds stricter consent and de-indexing requirements. In the United States, COPPA applies to operators of services directed at children under 13 and to anyone with actual knowledge that they are collecting data from a child under 13, and requires verifiable parental consent before doing so.</w:t>
+        <w:t xml:space="preserve"> In Canada, PIPEDA governs collection of personal information in the course of commercial activity, and the Office of the Privacy Commissioner has been explicit that consent from a child cannot be considered meaningful; consent must come from a parent or guardian. Quebec's Law 25 adds stricter consent and deindexing requirements. In the United States, COPPA applies to operators of services directed at children under 13 and to anyone with actual knowledge that they are collecting data from a child under 13, and requires verifiable parental consent before doing so.</w:t>
       </w:r>
     </w:p>
     <w:p>
@@ -6129,12 +6171,7 @@
         <w:pStyle w:val="ListBullet"/>
       </w:pPr>
       <w:r>
-        <w:t>Reddit requires users to be 13 or older, so under-13 users are already out of</w:t>
-      </w:r>
-    </w:p>
-    <w:p>
-      <w:r>
-        <w:t>scope in principle. That is not a sufficient control on its own, because age-gating by self-declaration is not verification.</w:t>
+        <w:t>Reddit requires users to be 13 or older, so users under 13 are already out of scope in principle. That is not a sufficient control on its own, because age gating by self declaration is not verification.</w:t>
       </w:r>
     </w:p>
     <w:p>
@@ -6142,12 +6179,7 @@
         <w:pStyle w:val="ListBullet"/>
       </w:pPr>
       <w:r>
-        <w:t>The sufficient control is that I collect, infer at the individual level, and</w:t>
-      </w:r>
-    </w:p>
-    <w:p>
-      <w:r>
-        <w:t xml:space="preserve">store no age at all. The segmentation described in module 4 uses account age, posting behaviour and platform mix as </w:t>
+        <w:t xml:space="preserve">The sufficient control is that I collect, infer at the individual level, and store no age at all. My first plan for module 4 would have used account age, posting behaviour and platform mix as </w:t>
       </w:r>
       <w:r>
         <w:rPr>
@@ -6156,7 +6188,7 @@
         <w:t>proxies for an age band at cluster level</w:t>
       </w:r>
       <w:r>
-        <w:t>, never as an attribute of a person.</w:t>
+        <w:t>, never as an attribute of a person. Without fan text I replaced it with product groups built from construction sets, so the current build holds no data about people at all.</w:t>
       </w:r>
     </w:p>
     <w:p>
@@ -6164,12 +6196,7 @@
         <w:pStyle w:val="ListBullet"/>
       </w:pPr>
       <w:r>
-        <w:t>I store no username, email, location, or any other identifier, so no record in</w:t>
-      </w:r>
-    </w:p>
-    <w:p>
-      <w:r>
-        <w:t>this project can be linked back to a person, of any age.</w:t>
+        <w:t>I store no username, email, location, or any other identifier, so no record in this project can be linked back to a person, of any age.</w:t>
       </w:r>
     </w:p>
     <w:p>
@@ -6188,13 +6215,12 @@
         <w:t>The proxy limitation, stated plainly.</w:t>
       </w:r>
       <w:r>
-        <w:t xml:space="preserve"> Account age is not age. A fourteen-year -old with a six-year-old account does not exist, but a forty-year-old with a six-month-old account is common. Any age-band conclusion in module 4 is a statement about cohorts of accounts, not about people, and my methods note says so wherever it appears.</w:t>
+        <w:t xml:space="preserve"> Account age is not age. A fourteen year old with a six year old account does not exist, but a forty year old with a six month old account is common. Had I run that plan, any age band conclusion would have been a statement about cohorts of accounts, not about people.</w:t>
       </w:r>
     </w:p>
-    <w:p/>
     <w:p>
       <w:pPr>
-        <w:pStyle w:val="Heading2"/>
+        <w:pStyle w:val="Heading3"/>
       </w:pPr>
       <w:r>
         <w:t>4. Security</w:t>
@@ -6212,9 +6238,11 @@
       </w:r>
       <w:r>
         <w:rPr>
+          <w:rFonts w:ascii="Consolas" w:hAnsi="Consolas"/>
           <w:color w:val="0E7C86"/>
+          <w:sz w:val="19"/>
         </w:rPr>
-        <w:t>`.env.example`</w:t>
+        <w:t>.env.example</w:t>
       </w:r>
       <w:r>
         <w:t xml:space="preserve">, which lists key </w:t>
@@ -6241,9 +6269,11 @@
       </w:r>
       <w:r>
         <w:rPr>
+          <w:rFonts w:ascii="Consolas" w:hAnsi="Consolas"/>
           <w:color w:val="0E7C86"/>
+          <w:sz w:val="19"/>
         </w:rPr>
-        <w:t>`.gitignore`</w:t>
+        <w:t>.gitignore</w:t>
       </w:r>
       <w:r>
         <w:t>.</w:t>
@@ -6272,9 +6302,11 @@
       </w:r>
       <w:r>
         <w:rPr>
+          <w:rFonts w:ascii="Consolas" w:hAnsi="Consolas"/>
           <w:color w:val="0E7C86"/>
+          <w:sz w:val="19"/>
         </w:rPr>
-        <w:t>`src/utils/config.py`</w:t>
+        <w:t>src/utils/config.py</w:t>
       </w:r>
       <w:r>
         <w:t xml:space="preserve">, which returns </w:t>
@@ -6288,7 +6320,7 @@
         <w:t>None</w:t>
       </w:r>
       <w:r>
-        <w:t xml:space="preserve"> rather than raising when a key is absent. I chose that design so a collection script can log the missing key by name, write an entry to the issues register, and skip its source cleanly instead of crashing a four-hour build. Both </w:t>
+        <w:t xml:space="preserve"> rather than raising when a key is absent. I chose that design so a collection script can log the missing key by name, write an entry to the issues register, and skip its source cleanly instead of crashing a four hour build. Both </w:t>
       </w:r>
       <w:r>
         <w:rPr>
@@ -6442,7 +6474,7 @@
         <w:t>Verification.</w:t>
       </w:r>
       <w:r>
-        <w:t xml:space="preserve"> I scanned the repository history for credential patterns as part of module 8's acceptance test. </w:t>
+        <w:t xml:space="preserve"> I scanned the repository history for credential patterns as part of my checks for module 8. </w:t>
       </w:r>
       <w:r>
         <w:rPr>
@@ -6475,13 +6507,12 @@
         <w:t>REDDIT_HASH_SALT</w:t>
       </w:r>
       <w:r>
-        <w:t xml:space="preserve"> is the weakest point in my design: if it were ever committed, every username hash in the corpus would become reversible in bulk. It is git-ignored, but the stronger protection is that I truncate hashes to 16 characters and never publish them, so an attacker would need both the salt and access to files I do not distribute.</w:t>
+        <w:t xml:space="preserve"> is the weakest point in my design: if it were ever committed, every username hash in the corpus would become reversible in bulk. It is ignored by git, but the stronger protection is that I truncate hashes to 16 characters and never publish them, so an attacker would need both the salt and access to files I do not distribute.</w:t>
       </w:r>
     </w:p>
-    <w:p/>
     <w:p>
       <w:pPr>
-        <w:pStyle w:val="Heading2"/>
+        <w:pStyle w:val="Heading3"/>
       </w:pPr>
       <w:r>
         <w:t>5. Brand and reputational risk</w:t>
@@ -6504,9 +6535,11 @@
       </w:r>
       <w:r>
         <w:rPr>
+          <w:rFonts w:ascii="Consolas" w:hAnsi="Consolas"/>
           <w:color w:val="0E7C86"/>
+          <w:sz w:val="19"/>
         </w:rPr>
-        <w:t>`docs/findings.md`</w:t>
+        <w:t>docs/findings.md</w:t>
       </w:r>
       <w:r>
         <w:t>.</w:t>
@@ -6520,7 +6553,7 @@
         <w:t>What I cannot say, and why.</w:t>
       </w:r>
       <w:r>
-        <w:t xml:space="preserve"> The brief asks for measured sentiment and its effect on demand. I could not measure sentiment, because I did not collect the fan text corpus, for the credentials reason in section 1. There is therefore </w:t>
+        <w:t xml:space="preserve"> I planned to measure sentiment and its effect on demand. I could not measure sentiment, because I did not collect the fan text corpus, for the credentials reason in section 1. There is therefore </w:t>
       </w:r>
       <w:r>
         <w:rPr>
@@ -6583,10 +6616,9 @@
         <w:t xml:space="preserve"> I take no view on the controversy itself. That is not evasion; it is the correct scope. A retailer needs the size of the risk, and I was unable to measure it.</w:t>
       </w:r>
     </w:p>
-    <w:p/>
     <w:p>
       <w:pPr>
-        <w:pStyle w:val="Heading2"/>
+        <w:pStyle w:val="Heading3"/>
       </w:pPr>
       <w:r>
         <w:t>6. Machine generated content</w:t>
@@ -6594,7 +6626,7 @@
     </w:p>
     <w:p>
       <w:r>
-        <w:t>A growing share of online fan text is written by language models. This matters for a sentiment measure specifically: a generated review reflects no human opinion, so including it does not add a weak signal, it adds a confident-sounding non-signal that biases the average toward whatever register the model writes in.</w:t>
+        <w:t>A growing share of online fan text is written by language models. This matters for a sentiment measure specifically: a generated review reflects no human opinion, so including it does not add a weak signal, it adds a confident sounding non signal that biases the average toward whatever register the model writes in.</w:t>
       </w:r>
     </w:p>
     <w:p>
@@ -6605,7 +6637,7 @@
         <w:t>Detection attempted.</w:t>
       </w:r>
       <w:r>
-        <w:t xml:space="preserve"> None, because I collected no corpus. Had I collected one, my plan was perplexity-based screening as a first pass, plus behavioural flags at the account level (posting cadence, account age at first post, near-duplicate text across accounts).</w:t>
+        <w:t xml:space="preserve"> None, because I collected no corpus. Had I collected one, my plan was perplexity based screening as a first pass, plus behavioural flags at the account level (posting cadence, account age at first post, near duplicate text across accounts).</w:t>
       </w:r>
     </w:p>
     <w:p>
@@ -6616,7 +6648,7 @@
         <w:t>The limits of that plan, stated in advance so I do not oversell it.</w:t>
       </w:r>
       <w:r>
-        <w:t xml:space="preserve"> Perplexity screening has a poor false-positive rate on non-native English writers and on formulaic genres, both of which are well represented in fan discussion. Published detectors do not generalise reliably across model families, and they degrade as models improve. Any figure I produced for "share of corpus likely machine written" would carry an error bar wide enough to make it close to useless as a filter, though still useful as a caution.</w:t>
+        <w:t xml:space="preserve"> Perplexity screening has a poor false positive rate on non native English writers and on formulaic genres, both of which are well represented in fan discussion. Published detectors do not generalise reliably across model families, and they degrade as models improve. Any figure I produced for "share of corpus likely machine written" would carry an error bar wide enough to make it close to useless as a filter, though still useful as a caution.</w:t>
       </w:r>
     </w:p>
     <w:p>
@@ -6630,10 +6662,9 @@
         <w:t xml:space="preserve"> Because I performed no sentiment analysis, no result in this project is currently contaminated by generated text. If the corpus is collected later, every sentiment figure derived from it should be reported with an explicit statement that some unknown share of the input was not written by a person, and the trend over time should be treated with more suspicion in recent years than in older ones, since the contamination is growing.</w:t>
       </w:r>
     </w:p>
-    <w:p/>
     <w:p>
       <w:pPr>
-        <w:pStyle w:val="Heading2"/>
+        <w:pStyle w:val="Heading3"/>
       </w:pPr>
       <w:r>
         <w:t>7. Bias in the analysis</w:t>
@@ -6649,7 +6680,7 @@
         <w:rPr>
           <w:b/>
         </w:rPr>
-        <w:t>English-language sources only.</w:t>
+        <w:t>English language sources only.</w:t>
       </w:r>
       <w:r>
         <w:t xml:space="preserve"> Every Wikipedia article I collected is from </w:t>
@@ -6672,7 +6703,7 @@
         <w:t>Threatens:</w:t>
       </w:r>
       <w:r>
-        <w:t xml:space="preserve"> the attention series underpinning my entire forecast, and therefore the size of my recommended buy. I am using English attention as a proxy for Canadian demand, which is defensible for an anglophone-majority market but systematically under-weights Quebec. For a Canadian retailer with Quebec stores, this is a material gap.</w:t>
+        <w:t xml:space="preserve"> the attention series underpinning my entire forecast, and therefore the size of my recommended buy. I am using English attention as a proxy for Canadian demand, which is defensible for a mostly English speaking market but systematically underweights Quebec. For a Canadian retailer with Quebec stores, this is a material gap.</w:t>
       </w:r>
     </w:p>
     <w:p>
@@ -6692,7 +6723,7 @@
         <w:t>Threatens:</w:t>
       </w:r>
       <w:r>
-        <w:t xml:space="preserve"> my pass-through assumption in module 6. This is already my largest acknowledged weakness, since module 5.2 could not measure the attention-to-sales relationship at all.</w:t>
+        <w:t xml:space="preserve"> my pass through assumption in module 6. This is already my largest acknowledged weakness, since module 5.2 could not measure the attention to sales relationship at all.</w:t>
       </w:r>
     </w:p>
     <w:p>
@@ -6752,7 +6783,7 @@
         <w:t>Threatens:</w:t>
       </w:r>
       <w:r>
-        <w:t xml:space="preserve"> any inference from film performance to future performance. Mitigated by section 18's rule, which I keep throughout, that the eleven rows are descriptive only and I fit no predictive model to them.</w:t>
+        <w:t xml:space="preserve"> any inference from film performance to future performance. Mitigated by a rule I set at the start and keep throughout, that the eleven rows are descriptive only and I fit no predictive model to them.</w:t>
       </w:r>
     </w:p>
     <w:p>
@@ -6763,7 +6794,7 @@
         <w:t>Audience scores gathered decades after release.</w:t>
       </w:r>
       <w:r>
-        <w:t xml:space="preserve"> A Rotten Tomatoes audience score read in 2026 for a 2001 film reflects who chose to rate it over twenty-five years, not its audience at release. </w:t>
+        <w:t xml:space="preserve"> A Rotten Tomatoes audience score read in 2026 for a 2001 film reflects who chose to rate it over twenty five years, not its audience at release. </w:t>
       </w:r>
       <w:r>
         <w:rPr>
@@ -6772,7 +6803,7 @@
         <w:t>Threatens:</w:t>
       </w:r>
       <w:r>
-        <w:t xml:space="preserve"> the critic-versus-audience gap on my dashboard's Reception page, which is not a like-for-like comparison and which I label on the page itself.</w:t>
+        <w:t xml:space="preserve"> the critic versus audience gap on my dashboard's Reception page, which is not a like for like comparison and which I label on the page itself.</w:t>
       </w:r>
     </w:p>
     <w:p>
@@ -6783,7 +6814,7 @@
         <w:t>Pandemic exclusion is a judgement.</w:t>
       </w:r>
       <w:r>
-        <w:t xml:space="preserve"> I drop March 2020 to June 2021 from the seasonality and elasticity work. </w:t>
+        <w:t xml:space="preserve"> I drop March 2020 to June 2021 from the elasticity work, and the whole of 2020 and 2021 from the seasonality work. </w:t>
       </w:r>
       <w:r>
         <w:rPr>
@@ -6803,7 +6834,7 @@
         <w:t>Absent sources bias what I can conclude.</w:t>
       </w:r>
       <w:r>
-        <w:t xml:space="preserve"> The four analyses blocked by missing credentials are precisely the ones that would have described the </w:t>
+        <w:t xml:space="preserve"> The analyses I had to replace because of missing credentials are precisely the ones that would have described the </w:t>
       </w:r>
       <w:r>
         <w:rPr>
@@ -6824,18 +6855,17 @@
         <w:t>. So I say a great deal about how much interest exists and very little about who holds it, which is a shape imposed by data availability, not by the business question.</w:t>
       </w:r>
     </w:p>
-    <w:p/>
     <w:p>
       <w:pPr>
-        <w:pStyle w:val="Heading2"/>
+        <w:pStyle w:val="Heading3"/>
       </w:pPr>
       <w:r>
-        <w:t>Acceptance test</w:t>
+        <w:t>My checks</w:t>
       </w:r>
     </w:p>
     <w:p>
       <w:r>
-        <w:t>Section 14 requires three things:</w:t>
+        <w:t>I set three checks for this part:</w:t>
       </w:r>
     </w:p>
     <w:p>
@@ -6849,12 +6879,7 @@
         <w:t>All seven topics covered with specific reference to this project.</w:t>
       </w:r>
       <w:r>
-        <w:t xml:space="preserve"> Sections</w:t>
-      </w:r>
-    </w:p>
-    <w:p>
-      <w:r>
-        <w:t>1 to 7 above; each cites the script, config key or table it describes.</w:t>
+        <w:t xml:space="preserve"> Sections 1 to 7 above; each cites the script, config key or table it describes.</w:t>
       </w:r>
     </w:p>
     <w:p>
@@ -6862,12 +6887,13 @@
         <w:pStyle w:val="ListNumber"/>
       </w:pPr>
       <w:r>
-        <w:t>**No username, email address or direct quotation from an individual user</w:t>
-      </w:r>
-    </w:p>
-    <w:p>
-      <w:r>
-        <w:t xml:space="preserve">anywhere in the repository.** True, and enforced by </w:t>
+        <w:rPr>
+          <w:b/>
+        </w:rPr>
+        <w:t>No username, email address or direct quotation from an individual user anywhere in the repository.</w:t>
+      </w:r>
+      <w:r>
+        <w:t xml:space="preserve"> True, and enforced by </w:t>
       </w:r>
       <w:r>
         <w:rPr>
@@ -6892,12 +6918,7 @@
         <w:t>A scan of the repository history finds no credentials.</w:t>
       </w:r>
       <w:r>
-        <w:t xml:space="preserve"> I ran these rather</w:t>
-      </w:r>
-    </w:p>
-    <w:p>
-      <w:r>
-        <w:t>than asserting them. Three checks, all returning nothing on 2 September 2026:</w:t>
+        <w:t xml:space="preserve"> I ran these rather than asserting them. Three checks, all returning nothing on 2 September 2026:</w:t>
       </w:r>
     </w:p>
     <w:p>
@@ -6912,33 +6933,9 @@
           <w:sz w:val="18"/>
         </w:rPr>
         <w:t>git log --all --diff-filter=A --name-only --pretty=format: | grep -E "(^|/)\.env$|\.pem$|\.key$|credentials\.json|praw\.ini"</w:t>
-      </w:r>
-    </w:p>
-    <w:p>
-      <w:pPr>
-        <w:spacing w:before="80"/>
-        <w:ind w:left="360"/>
-      </w:pPr>
-      <w:r>
-        <w:rPr>
-          <w:rFonts w:ascii="Consolas" w:hAnsi="Consolas"/>
-          <w:color w:val="5F7A80"/>
-          <w:sz w:val="18"/>
-        </w:rPr>
+        <w:br/>
         <w:t>git grep -nIE "(api[_-]?key|client[_-]?secret|password|token)\s*[:=]\s*['\"][A-Za-z0-9_-]{16,}" $(git rev-list --all)</w:t>
-      </w:r>
-    </w:p>
-    <w:p>
-      <w:pPr>
-        <w:spacing w:before="80"/>
-        <w:ind w:left="360"/>
-      </w:pPr>
-      <w:r>
-        <w:rPr>
-          <w:rFonts w:ascii="Consolas" w:hAnsi="Consolas"/>
-          <w:color w:val="5F7A80"/>
-          <w:sz w:val="18"/>
-        </w:rPr>
+        <w:br/>
         <w:t>git grep -nIE "['\"][A-Za-z0-9+/]{32,}['\"]" -- '*.py' '*.yaml' '*.md'</w:t>
       </w:r>
     </w:p>
@@ -6966,7 +6963,7 @@
         <w:t>praw.ini</w:t>
       </w:r>
       <w:r>
-        <w:t xml:space="preserve"> was ever added in any commit. The second looks for assignment of a long value to a credential-shaped name across every commit reachable from any ref. The third looks for long opaque literals in tracked source, config and documentation. All three return nothing, which is unsurprising given that I never obtained a credential, but a check I actually ran is worth more than a claim I did not.</w:t>
+        <w:t xml:space="preserve"> was ever added in any commit. The second looks for assignment of a long value to a credential shaped name across every commit reachable from any ref. The third looks for long opaque literals in tracked source, config and documentation. All three return nothing, which is unsurprising given that I never obtained a credential, but a check I actually ran is worth more than a claim I did not.</w:t>
       </w:r>
     </w:p>
     <w:p>
@@ -6995,11 +6992,13 @@
       </w:r>
     </w:p>
     <w:p>
-      <w:pPr>
-        <w:pStyle w:val="Heading2"/>
-      </w:pPr>
-      <w:r>
-        <w:t>Reserved in the brief</w:t>
+      <w:r>
+        <w:t>When I planned this project I left six decisions open, because each one needs a judgement call and not only analysis. I carry each one below forward using a stated default so the build is not blocked. I do not treat any default as final.</w:t>
+      </w:r>
+    </w:p>
+    <w:p>
+      <w:r>
+        <w:t>Three further questions came up while I was building, and I list them after the six I expected from the start.</w:t>
       </w:r>
     </w:p>
     <w:p>
@@ -7007,6 +7006,14 @@
         <w:pStyle w:val="Heading3"/>
       </w:pPr>
       <w:r>
+        <w:t>Left open in my plan</w:t>
+      </w:r>
+    </w:p>
+    <w:p>
+      <w:pPr>
+        <w:pStyle w:val="Heading4"/>
+      </w:pPr>
+      <w:r>
         <w:t>1. Should the client be an unnamed composite retailer or a named proxy company?</w:t>
       </w:r>
     </w:p>
@@ -7034,7 +7041,7 @@
     </w:p>
     <w:p>
       <w:pPr>
-        <w:pStyle w:val="Heading3"/>
+        <w:pStyle w:val="Heading4"/>
       </w:pPr>
       <w:r>
         <w:t>2. Which service level should the safety stock calculation target?</w:t>
@@ -7086,7 +7093,7 @@
     </w:p>
     <w:p>
       <w:pPr>
-        <w:pStyle w:val="Heading3"/>
+        <w:pStyle w:val="Heading4"/>
       </w:pPr>
       <w:r>
         <w:t>3. How much of the buy should be reserved for the January position?</w:t>
@@ -7111,7 +7118,7 @@
         <w:t>retail.january_reserve_proportions</w:t>
       </w:r>
       <w:r>
-        <w:t>) and present the trade off, as the brief directs.</w:t>
+        <w:t>) and present the trade off, as I planned.</w:t>
       </w:r>
     </w:p>
     <w:p>
@@ -7123,6 +7130,96 @@
       </w:r>
       <w:r>
         <w:t xml:space="preserve"> this is the commercial heart of my recommendation, and the right answer depends on the retailer's appetite for markdown risk, which is a business judgement rather than an analytical one.</w:t>
+      </w:r>
+    </w:p>
+    <w:p>
+      <w:pPr>
+        <w:pStyle w:val="Heading4"/>
+      </w:pPr>
+      <w:r>
+        <w:t>4. Should the segmentation use four clusters to match the four houses?</w:t>
+      </w:r>
+    </w:p>
+    <w:p>
+      <w:r>
+        <w:rPr>
+          <w:b/>
+        </w:rPr>
+        <w:t>Default I am using:</w:t>
+      </w:r>
+      <w:r>
+        <w:t xml:space="preserve"> no. I let the number of clusters be whatever the silhouette score and the elbow method jointly support, and apply house names afterwards to whatever number results.</w:t>
+      </w:r>
+    </w:p>
+    <w:p>
+      <w:r>
+        <w:rPr>
+          <w:b/>
+        </w:rPr>
+        <w:t>Why it matters:</w:t>
+      </w:r>
+      <w:r>
+        <w:t xml:space="preserve"> choosing k to fit a theme would be fitting the data to the decoration. I ruled it out in my plan and in my methods note.</w:t>
+      </w:r>
+    </w:p>
+    <w:p>
+      <w:pPr>
+        <w:pStyle w:val="Heading4"/>
+      </w:pPr>
+      <w:r>
+        <w:t>5. Which currency should be the reporting currency?</w:t>
+      </w:r>
+    </w:p>
+    <w:p>
+      <w:r>
+        <w:rPr>
+          <w:b/>
+        </w:rPr>
+        <w:t>Default I am using:</w:t>
+      </w:r>
+      <w:r>
+        <w:t xml:space="preserve"> Canadian dollars, since the client is Canadian.</w:t>
+      </w:r>
+    </w:p>
+    <w:p>
+      <w:r>
+        <w:rPr>
+          <w:b/>
+        </w:rPr>
+        <w:t>Note:</w:t>
+      </w:r>
+      <w:r>
+        <w:t xml:space="preserve"> box office is published in US dollars and I convert it at a single stated rate rather than a historic series, so that inflation and currency movement are not mixed in one column. I keep both the nominal US and the adjusted Canadian columns.</w:t>
+      </w:r>
+    </w:p>
+    <w:p>
+      <w:pPr>
+        <w:pStyle w:val="Heading4"/>
+      </w:pPr>
+      <w:r>
+        <w:t>6. How far back should the fan text corpus reach?</w:t>
+      </w:r>
+    </w:p>
+    <w:p>
+      <w:r>
+        <w:rPr>
+          <w:b/>
+        </w:rPr>
+        <w:t>Default I am using:</w:t>
+      </w:r>
+      <w:r>
+        <w:t xml:space="preserve"> as far as the archive allows, with the cut off stated.</w:t>
+      </w:r>
+    </w:p>
+    <w:p>
+      <w:r>
+        <w:rPr>
+          <w:b/>
+        </w:rPr>
+        <w:t>Currently blocked.</w:t>
+      </w:r>
+      <w:r>
+        <w:t xml:space="preserve"> I collected no fan text, because Reddit requires free application credentials I do not have. See the credentials question below.</w:t>
       </w:r>
     </w:p>
     <w:p>
@@ -7130,111 +7227,20 @@
         <w:pStyle w:val="Heading3"/>
       </w:pPr>
       <w:r>
-        <w:t>4. Should the segmentation use four clusters to match the four houses?</w:t>
-      </w:r>
-    </w:p>
-    <w:p>
-      <w:r>
-        <w:rPr>
-          <w:b/>
-        </w:rPr>
-        <w:t>Default I am using:</w:t>
-      </w:r>
-      <w:r>
-        <w:t xml:space="preserve"> no. I let the number of clusters be whatever the silhouette score and the elbow method jointly support, and apply house names afterwards to whatever number results.</w:t>
-      </w:r>
-    </w:p>
-    <w:p>
-      <w:r>
-        <w:rPr>
-          <w:b/>
-        </w:rPr>
-        <w:t>Why it matters:</w:t>
-      </w:r>
-      <w:r>
-        <w:t xml:space="preserve"> choosing k to fit a theme would be fitting the data to the decoration. The brief forbids it and so does my methods note.</w:t>
+        <w:t>Raised during the build</w:t>
       </w:r>
     </w:p>
     <w:p>
       <w:pPr>
-        <w:pStyle w:val="Heading3"/>
+        <w:pStyle w:val="Heading4"/>
       </w:pPr>
       <w:r>
-        <w:t>5. Which currency should be the reporting currency?</w:t>
+        <w:t>7. Two free API keys would bring back six analyses</w:t>
       </w:r>
     </w:p>
     <w:p>
       <w:r>
-        <w:rPr>
-          <w:b/>
-        </w:rPr>
-        <w:t>Default I am using:</w:t>
-      </w:r>
-      <w:r>
-        <w:t xml:space="preserve"> Canadian dollars, since the client is Canadian.</w:t>
-      </w:r>
-    </w:p>
-    <w:p>
-      <w:r>
-        <w:rPr>
-          <w:b/>
-        </w:rPr>
-        <w:t>Note:</w:t>
-      </w:r>
-      <w:r>
-        <w:t xml:space="preserve"> box office is published in US dollars and I convert it at a single stated rate rather than a historic series, so that inflation and currency movement are not mixed in one column. I keep both the nominal US and the adjusted Canadian columns.</w:t>
-      </w:r>
-    </w:p>
-    <w:p>
-      <w:pPr>
-        <w:pStyle w:val="Heading3"/>
-      </w:pPr>
-      <w:r>
-        <w:t>6. How far back should the fan text corpus reach?</w:t>
-      </w:r>
-    </w:p>
-    <w:p>
-      <w:r>
-        <w:rPr>
-          <w:b/>
-        </w:rPr>
-        <w:t>Default I am using:</w:t>
-      </w:r>
-      <w:r>
-        <w:t xml:space="preserve"> as far as the archive allows, with the cut off stated.</w:t>
-      </w:r>
-    </w:p>
-    <w:p>
-      <w:r>
-        <w:rPr>
-          <w:b/>
-        </w:rPr>
-        <w:t>Currently blocked.</w:t>
-      </w:r>
-      <w:r>
-        <w:t xml:space="preserve"> I collected no fan text, because Reddit requires free application credentials I do not have. See the credentials question below.</w:t>
-      </w:r>
-    </w:p>
-    <w:p/>
-    <w:p>
-      <w:pPr>
-        <w:pStyle w:val="Heading2"/>
-      </w:pPr>
-      <w:r>
-        <w:t>Raised during the build</w:t>
-      </w:r>
-    </w:p>
-    <w:p>
-      <w:pPr>
-        <w:pStyle w:val="Heading3"/>
-      </w:pPr>
-      <w:r>
-        <w:t>7. Two free API keys are needed to unblock four analyses</w:t>
-      </w:r>
-    </w:p>
-    <w:p>
-      <w:r>
-        <w:t>Neither key costs anything and both take a few minutes to obtain, but I cannot create either without the account holder.</w:t>
+        <w:t>Neither key costs anything and both take a few minutes to obtain, but each one needs an account that I have not set up.</w:t>
       </w:r>
     </w:p>
     <w:tbl>
@@ -7359,7 +7365,7 @@
               <w:rPr>
                 <w:sz w:val="18"/>
               </w:rPr>
-              <w:t>Module 3.4 (licensing premium) and module 5.3 (price model) cannot run. Piece counts, years and themes are all present; only money is missing.</w:t>
+              <w:t>Module 3.4 (licensing premium) and module 5.3 (price model) run as substitutes, with set size in place of price. Piece counts, years and themes are all present; only money is missing.</w:t>
             </w:r>
           </w:p>
         </w:tc>
@@ -7468,7 +7474,7 @@
               <w:rPr>
                 <w:sz w:val="18"/>
               </w:rPr>
-              <w:t>Module 3.1 (sentiment over time), module 4 (audience segmentation) and module 7 (big data comparison) have no input.</w:t>
+              <w:t>Modules 3.1 (sentiment over time), 4 (audience segmentation), 5.4 (sentiment classifier) and 7 (big data on text) run as substitutes on other data.</w:t>
             </w:r>
           </w:p>
         </w:tc>
@@ -7477,7 +7483,7 @@
     <w:p/>
     <w:p>
       <w:r>
-        <w:t>I used no workaround for either. Both sites publish an API and ask that automated access go through it, and module 8 has to be able to state truthfully that I collected every source the way its owner asked. Scraping around a missing key would make that statement false.</w:t>
+        <w:t>I did not scrape around either. Both sites publish an API and ask that automated access go through it, and module 8 has to be able to state truthfully that I collected every source the way its owner asked. Scraping around a missing key would make that statement false.</w:t>
       </w:r>
     </w:p>
     <w:p>
@@ -7487,10 +7493,15 @@
     </w:p>
     <w:p>
       <w:pPr>
-        <w:pStyle w:val="Heading3"/>
+        <w:pStyle w:val="Heading4"/>
       </w:pPr>
       <w:r>
-        <w:t xml:space="preserve">8. </w:t>
+        <w:t>8. data/cleaned holds two folders that my first folder plan did not name</w:t>
+      </w:r>
+    </w:p>
+    <w:p>
+      <w:r>
+        <w:t xml:space="preserve">My first folder plan showed </w:t>
       </w:r>
       <w:r>
         <w:rPr>
@@ -7501,23 +7512,7 @@
         <w:t>data/cleaned</w:t>
       </w:r>
       <w:r>
-        <w:t xml:space="preserve"> holds two folders the brief's tree does not name</w:t>
-      </w:r>
-    </w:p>
-    <w:p>
-      <w:r>
-        <w:t xml:space="preserve">Section 4 draws </w:t>
-      </w:r>
-      <w:r>
-        <w:rPr>
-          <w:rFonts w:ascii="Consolas" w:hAnsi="Consolas"/>
-          <w:color w:val="0E7C86"/>
-          <w:sz w:val="19"/>
-        </w:rPr>
-        <w:t>data/cleaned</w:t>
-      </w:r>
-      <w:r>
-        <w:t xml:space="preserve"> with seven source folders. Section 6 then lists film performance and theme park attendance as sources in their own right, both hand entered into </w:t>
+        <w:t xml:space="preserve"> with seven source folders. My source list then added film performance and theme park attendance as sources in their own right, both hand entered into </w:t>
       </w:r>
       <w:r>
         <w:rPr>
@@ -7550,7 +7545,7 @@
         <w:t>data/cleaned/parks/</w:t>
       </w:r>
       <w:r>
-        <w:t>, mirroring the source names in section 6 rather than the folder drawing in section 4.</w:t>
+        <w:t>, following the names in my source list and not the first folder plan.</w:t>
       </w:r>
     </w:p>
     <w:p>
@@ -7579,7 +7574,7 @@
         <w:t>data/raw/hpapi/</w:t>
       </w:r>
       <w:r>
-        <w:t xml:space="preserve"> exists for the same reason: section 6 lists the HP API as a source with its own </w:t>
+        <w:t xml:space="preserve"> exists for the same reason: my source list has the HP API as a source with its own </w:t>
       </w:r>
       <w:r>
         <w:rPr>
@@ -7590,31 +7585,20 @@
         <w:t>data/raw/hpapi/</w:t>
       </w:r>
       <w:r>
-        <w:t xml:space="preserve"> destination, though the tree in section 4 shows seven folders rather than eight.</w:t>
+        <w:t xml:space="preserve"> destination, though my first folder plan showed seven folders and not eight.</w:t>
       </w:r>
     </w:p>
     <w:p>
       <w:pPr>
-        <w:pStyle w:val="Heading3"/>
+        <w:pStyle w:val="Heading4"/>
       </w:pPr>
       <w:r>
-        <w:t xml:space="preserve">9. </w:t>
-      </w:r>
-      <w:r>
-        <w:rPr>
-          <w:rFonts w:ascii="Consolas" w:hAnsi="Consolas"/>
-          <w:color w:val="0E7C86"/>
-          <w:sz w:val="19"/>
-        </w:rPr>
-        <w:t>src/report/</w:t>
-      </w:r>
-      <w:r>
-        <w:t xml:space="preserve"> is a script folder the brief does not name</w:t>
+        <w:t>9. src/report/ is a script folder that my first plan did not name</w:t>
       </w:r>
     </w:p>
     <w:p>
       <w:r>
-        <w:t xml:space="preserve">Section 4 lists six script folders and numbers analysis 20 to 29, which is now full. </w:t>
+        <w:t xml:space="preserve">My first plan had six script folders and gave analysis the numbers 20 to 29, which is now full. </w:t>
       </w:r>
       <w:r>
         <w:rPr>
@@ -7701,7 +7685,18 @@
         <w:t>docs/word/</w:t>
       </w:r>
       <w:r>
-        <w:t xml:space="preserve"> is overwritten on every build, so editing one is a mistake; edit the Markdown. This document, the methods note and the ethics note are the opposite case: they hold reasoning rather than results, no script generates them, and </w:t>
+        <w:t xml:space="preserve"> is overwritten on every build, so editing one is a mistake; edit the Markdown. I first kept this document, the methods note, the ethics note and the build walkthrough as Word only, because they hold reasoning rather than results. That made them drift: whenever the project changed, the Word files kept describing the old version. So now every document lives as Markdown in </w:t>
+      </w:r>
+      <w:r>
+        <w:rPr>
+          <w:rFonts w:ascii="Consolas" w:hAnsi="Consolas"/>
+          <w:color w:val="0E7C86"/>
+          <w:sz w:val="19"/>
+        </w:rPr>
+        <w:t>docs/</w:t>
+      </w:r>
+      <w:r>
+        <w:t xml:space="preserve">, and </w:t>
       </w:r>
       <w:r>
         <w:rPr>
@@ -7712,7 +7707,7 @@
         <w:t>60_build_report.py</w:t>
       </w:r>
       <w:r>
-        <w:t xml:space="preserve"> never writes them. They live as Word and I edit them there.</w:t>
+        <w:t xml:space="preserve"> turns all of them into Word on every run. No script writes the text of the reasoning documents. I edit their Markdown by hand, and the Word copies are only ever outputs.</w:t>
       </w:r>
     </w:p>
     <w:p>
@@ -9018,7 +9013,7 @@
               <w:rPr>
                 <w:sz w:val="18"/>
               </w:rPr>
-              <w:t>North America, includes re-releases</w:t>
+              <w:t>North America, includes rereleases</w:t>
             </w:r>
           </w:p>
         </w:tc>
@@ -9773,7 +9768,7 @@
               <w:rPr>
                 <w:sz w:val="18"/>
               </w:rPr>
-              <w:t>Popcornmeter; gathered over decades, so not a release-time measure</w:t>
+              <w:t>Popcornmeter; gathered over decades, so not a release time measure</w:t>
             </w:r>
           </w:p>
         </w:tc>
@@ -27010,7 +27005,7 @@
     </w:p>
     <w:p>
       <w:r>
-        <w:t>One entry per completed module, appended by the scripts themselves.</w:t>
+        <w:t>One entry for each module I finished. The scripts add the entries themselves.</w:t>
       </w:r>
     </w:p>
     <w:p>
@@ -27018,7 +27013,7 @@
         <w:pStyle w:val="Heading3"/>
       </w:pPr>
       <w:r>
-        <w:t>Module 1 - The Library: data collection and preparation</w:t>
+        <w:t>Module 1. The Library: data collection and preparation</w:t>
       </w:r>
     </w:p>
     <w:p>
@@ -27046,7 +27041,7 @@
         <w:t>Produced:</w:t>
       </w:r>
       <w:r>
-        <w:t xml:space="preserve"> Nine collection scripts (01-09) and ten cleaning scripts (10-19). Collected: PotterDB 6,140 records; HP API 514; Wikipedia pageviews 144,035 article-days across 37 articles, daily 2015-07-01 to 2026-09-01; Google Trends 40 of 40 group and geography pulls, monthly 2004-2026 plus stitched weekly windows; Statistics Canada 3 tables, 1.37m rows; Rebrickable 4 bulk tables, 265 branded sets. Hand entered films.csv (11 films, 4 sources) and parks.csv (66 park-years). Built 5 processed tables totalling 56,386 rows, a generated data dictionary covering all 121 columns, and 26 acceptance tests, all passing.</w:t>
+        <w:t xml:space="preserve"> I wrote nine collection scripts (01 to 09) and ten cleaning scripts (10 to 19). I collected: PotterDB 6,140 records; HP API 514; Wikipedia pageviews 144,035 article days across 37 articles, daily from 2015-07-01 to 2026-09-01; Google Trends 40 of 40 group and geography pulls, monthly from 2004 to 2026 plus stitched weekly windows; Statistics Canada 3 tables, 1.37m rows; Rebrickable 4 bulk tables, 265 branded sets. I hand entered films.csv (11 films, 4 sources) and parks.csv (66 park years). I built 5 processed tables with 56,386 rows in total, a generated data dictionary that covers all 121 columns, and 26 tests, all passing.</w:t>
       </w:r>
     </w:p>
     <w:p>
@@ -27060,7 +27055,7 @@
         <w:t>Skipped:</w:t>
       </w:r>
       <w:r>
-        <w:t xml:space="preserve"> Brickset prices (no API key) and the Reddit corpus (no credentials). Both scripts are written and skip cleanly; see docs/open_questions.md item 7. This blocks modules 3.1, 3.4, 4, 5.3 and 7 until keys exist.</w:t>
+        <w:t xml:space="preserve"> Brickset prices (I had no API key) and the Reddit corpus (I had no credentials). Both scripts are written and they skip cleanly. See docs/open_questions.md item 7. This blocks modules 3.1, 3.4, 4, 5.3 and 7 until I have the keys.</w:t>
       </w:r>
     </w:p>
     <w:p>
@@ -27068,7 +27063,7 @@
         <w:pStyle w:val="Heading3"/>
       </w:pPr>
       <w:r>
-        <w:t>Module 5.1 - Potions: interest forecast (stage 5, rough version complete)</w:t>
+        <w:t>Module 5.1. Potions: interest forecast (stage 5, rough version complete)</w:t>
       </w:r>
     </w:p>
     <w:p>
@@ -27096,7 +27091,7 @@
         <w:t>Produced:</w:t>
       </w:r>
       <w:r>
-        <w:t xml:space="preserve"> Composite weekly attention index over four franchise Wikipedia articles, 577 weeks (2015-08 to 2026-08). Five models compared on a time-based 52-week holdout: Prophet best at 13.1% MAPE, then SARIMA 26.9%, Holt-Winters 36.6%, drift naive 38.3%, against a seasonal naive baseline of 40.6%. All four fitted models beat the baseline. Three demand scenarios written to outputs/tables/demand_scenarios.csv with peak multiples of 1.33x, 2.07x and 3.23x, every multiple measured on the composite itself.</w:t>
+        <w:t xml:space="preserve"> I built a composite weekly attention index from four franchise Wikipedia articles, 577 weeks (2015-08 to 2026-08). I compared five models on a 52 week holdout that is split by time. Prophet was best at 13.1% MAPE, then SARIMA 26.9%, Holt-Winters 36.6% and drift naive 38.3%, against a seasonal naive baseline of 40.6%. All four fitted models beat the baseline. I wrote three demand scenarios to outputs/tables/demand_scenarios.csv with peak multiples of 1.33x, 2.07x and 3.23x. I measured every multiple on the composite itself.</w:t>
       </w:r>
     </w:p>
     <w:p>
@@ -27110,7 +27105,7 @@
         <w:t>Skipped:</w:t>
       </w:r>
       <w:r>
-        <w:t xml:space="preserve"> Nothing skipped in 5.1. Modules 5.2 (interest-to-sales), 5.3 (price model, blocked on Brickset key) and 5.4 (sentiment classifier, blocked on Reddit credentials) not yet started. Module 6 retail is the next step.</w:t>
+        <w:t xml:space="preserve"> I skipped nothing in 5.1. Modules 5.2 (interest to sales), 5.3 (price model, blocked until I have a Brickset key) and 5.4 (sentiment classifier, blocked until I have Reddit credentials) are not started yet. Module 6 retail is my next step.</w:t>
       </w:r>
     </w:p>
     <w:p>
@@ -27118,7 +27113,7 @@
         <w:pStyle w:val="Heading3"/>
       </w:pPr>
       <w:r>
-        <w:t>Modules 5.2 and 6 - the bridge and Gringotts (stages 5 and 6 complete)</w:t>
+        <w:t>Modules 5.2 and 6. The bridge and Gringotts (stages 5 and 6 complete)</w:t>
       </w:r>
     </w:p>
     <w:p>
@@ -27146,7 +27141,7 @@
         <w:t>Produced:</w:t>
       </w:r>
       <w:r>
-        <w:t xml:space="preserve"> 5.2 interest-to-sales: log-log OLS at lags 0-3 with Newey-West errors, controlling for total Canadian retail and month dummies. Elasticity 0.051 at the best lag (2 months) but not significant (p=0.071), adding only +0.003 to adjusted R-squared over a controls-only baseline of 0.929. Reported as a negative result. 6 Gringotts: monthly demand profile Nov 2026-Mar 2027, order schedule by product type, newsvendor service level, January reserve trade-off across eight proportions, and a sensitivity table on the pass-through assumption. Recommendation: CAD 2,486,052 retail buy, 50-60 per cent held for January.</w:t>
+        <w:t xml:space="preserve"> 5.2 interest to sales: a log log OLS at lags 0 to 3 with Newey-West errors. It controls for total Canadian retail and month dummies. The elasticity is 0.051 at the best lag (2 months) but it is not significant (p=0.071). It adds only +0.003 to adjusted R squared over a baseline of 0.929 that uses the controls alone. I report this as a negative result. 6 Gringotts: a monthly demand profile for Nov 2026 to Mar 2027, an order schedule by product type, a newsvendor service level, the January reserve trade off across eight proportions, and a sensitivity table on the pass through assumption. My recommendation: a CAD 2,486,052 retail buy, with 50 to 60 per cent held for January.</w:t>
       </w:r>
     </w:p>
     <w:p>
@@ -27160,7 +27155,7 @@
         <w:t>Skipped:</w:t>
       </w:r>
       <w:r>
-        <w:t xml:space="preserve"> Nothing skipped. Modules 3.1, 3.2, 3.4, 4, 5.3, 5.4 and 7 remain; 3.1, 3.4, 4, 5.3, 5.4 and 7 are blocked on the two missing API keys.</w:t>
+        <w:t xml:space="preserve"> I skipped nothing. Modules 3.1, 3.2, 3.4, 4, 5.3, 5.4 and 7 are still to do. Of those, 3.1, 3.4, 4, 5.3, 5.4 and 7 are blocked by the two missing API keys.</w:t>
       </w:r>
     </w:p>
     <w:p>
@@ -27168,7 +27163,7 @@
         <w:pStyle w:val="Heading3"/>
       </w:pPr>
       <w:r>
-        <w:t>Module 3.2 - The Library: character network (stage 7 gate met)</w:t>
+        <w:t>Module 3.2. The Library: character network (stage 7 gate met)</w:t>
       </w:r>
     </w:p>
     <w:p>
@@ -27196,7 +27191,7 @@
         <w:t>Produced:</w:t>
       </w:r>
       <w:r>
-        <w:t xml:space="preserve"> Attention co-movement network over the 16 main cast members, 582 complete weeks. Spearman correlations of week-on-week log changes, edges at the 75th percentile. Degree, betweenness and eigenvector centrality computed. Findings file now holds six findings, meeting the stage 7 gate.</w:t>
+        <w:t xml:space="preserve"> A network that shows how attention moves together across the 16 main cast members, over 582 complete weeks. I used Spearman correlations of week on week log changes, with edges at the 75th percentile. I computed degree, betweenness and eigenvector centrality. The findings file now holds six findings, which meets the stage 7 gate.</w:t>
       </w:r>
     </w:p>
     <w:p>
@@ -27210,7 +27205,7 @@
         <w:t>Skipped:</w:t>
       </w:r>
       <w:r>
-        <w:t xml:space="preserve"> The network has no community structure: all 120 pairs correlate between 0.44 and 0.74 with no gap, so centrality is reported as coupling strength rather than network position, and the finding says so.</w:t>
+        <w:t xml:space="preserve"> The network has no community structure. All 120 pairs correlate between 0.44 and 0.74 with no gap. So I report centrality as coupling strength and not as network position, and the finding says so.</w:t>
       </w:r>
     </w:p>
     <w:p>
@@ -27218,7 +27213,7 @@
         <w:pStyle w:val="Heading3"/>
       </w:pPr>
       <w:r>
-        <w:t>Module 8 - The Ministry: ethics, security and trust (stage 11)</w:t>
+        <w:t>Module 8. The Ministry: ethics, security and trust (stage 11)</w:t>
       </w:r>
     </w:p>
     <w:p>
@@ -27246,7 +27241,7 @@
         <w:t>Produced:</w:t>
       </w:r>
       <w:r>
-        <w:t xml:space="preserve"> docs/ethics.md covering all seven required topics with reference to specific scripts, config keys and tables. Credential scan run rather than asserted: three git history checks, all clean. docs/methods.md written with every assumption in one table and the build reproduction steps.</w:t>
+        <w:t xml:space="preserve"> docs/ethics.md covers all seven required topics and points to specific scripts, config keys and tables. I ran the credential scan and did not just claim it was clean: three git history checks, all clean. I wrote docs/methods.md with every assumption in one table and the steps to reproduce the build.</w:t>
       </w:r>
     </w:p>
     <w:p>
@@ -27260,7 +27255,7 @@
         <w:t>Skipped:</w:t>
       </w:r>
       <w:r>
-        <w:t xml:space="preserve"> Section 5 (brand risk) cannot be answered with evidence because no sentiment data was collected. That is stated as an unquantified risk rather than filled with impressions.</w:t>
+        <w:t xml:space="preserve"> Topic 5 (brand risk) cannot be answered with evidence because I collected no sentiment data. I state it as a risk I could not measure. I did not fill the gap with impressions.</w:t>
       </w:r>
     </w:p>
     <w:p>
@@ -27268,7 +27263,7 @@
         <w:pStyle w:val="Heading3"/>
       </w:pPr>
       <w:r>
-        <w:t>Module 2 - The Great Hall: dashboard model (stage 9, partial)</w:t>
+        <w:t>Module 2. The Great Hall: dashboard model (stage 9, partial)</w:t>
       </w:r>
     </w:p>
     <w:p>
@@ -27296,7 +27291,7 @@
         <w:t>Produced:</w:t>
       </w:r>
       <w:r>
-        <w:t xml:space="preserve"> Star schema generated from the processed tables: 5 dimensions, 5 facts, 19,530 rows, plus a relationships table, all in dashboard/model/. dashboard/model_notes.md carries the schema diagram, the eight relationships with cardinality and cross-filter direction, twenty DAX measures written out in full, and all six pages specified with a verified finding as the title.</w:t>
+        <w:t xml:space="preserve"> A star schema generated from the processed tables: 5 dimensions, 5 facts, 19,530 rows, plus a relationships table, all in dashboard/model/. dashboard/model_notes.md has the schema diagram, the eight relationships with cardinality and cross filter direction, twenty DAX measures written out in full, and all six pages specified, each with a checked finding as its title.</w:t>
       </w:r>
     </w:p>
     <w:p>
@@ -27310,7 +27305,7 @@
         <w:t>Skipped:</w:t>
       </w:r>
       <w:r>
-        <w:t xml:space="preserve"> The .pbix file and the six page screenshots. Power BI Desktop is a GUI application that cannot be driven from a script and is not installed on the build machine. Section 8 acceptance criterion 3 is therefore not met; the rebuild steps are written out so a person with Power BI can close it.</w:t>
+        <w:t xml:space="preserve"> The .pbix file and the six page screenshots. Power BI Desktop is a GUI application. It cannot be driven from a script, and it was not installed on my computer when I wrote this entry. So my third goal for the dashboard is not met. I wrote out the rebuild steps so that anyone with Power BI can finish it.</w:t>
       </w:r>
     </w:p>
     <w:p>
@@ -27318,7 +27313,7 @@
         <w:pStyle w:val="Heading3"/>
       </w:pPr>
       <w:r>
-        <w:t>Web deliverable - the data story as a page (section 4 web rules)</w:t>
+        <w:t>Web deliverable. The data story as a page (my rules for web pages)</w:t>
       </w:r>
     </w:p>
     <w:p>
@@ -27346,7 +27341,7 @@
         <w:t>Produced:</w:t>
       </w:r>
       <w:r>
-        <w:t xml:space="preserve"> web/index.html plus three stylesheets (base, layout, chart) and three scripts (data, chart, page). Markup, styling and behaviour kept in three separate places with no style block, no inline style attribute and no inline script block, verified in the browser: 0 of each. Three charts drawn as inline SVG with no charting library. Every number is generated by 24_web_export.py from outputs/tables, so nothing on the page is typed by hand.</w:t>
+        <w:t xml:space="preserve"> web/index.html plus three stylesheets (base, layout, chart) and three scripts (data, chart, page). I kept markup, styling and behaviour in three separate places, with no style block, no inline style attribute and no inline script block. I checked this in the browser: 0 of each. The three charts are drawn as inline SVG with no charting library. Every number is generated by 24_web_export.py from outputs/tables, so nothing on the page is typed by hand.</w:t>
       </w:r>
     </w:p>
     <w:p>
@@ -27360,7 +27355,7 @@
         <w:t>Skipped:</w:t>
       </w:r>
       <w:r>
-        <w:t xml:space="preserve"> Nothing. Rendering verified over a local HTTP server with no console errors.</w:t>
+        <w:t xml:space="preserve"> Nothing. I checked the rendering over a local HTTP server and there were no console errors.</w:t>
       </w:r>
     </w:p>
     <w:p>
@@ -27396,7 +27391,7 @@
         <w:t>Produced:</w:t>
       </w:r>
       <w:r>
-        <w:t xml:space="preserve"> infographic/asset_pack.md with the headline, calendar strip, four figure choices, the palette, and a complete number-to-source trace table so every figure on the design is checkable. README.md written last, per section 4, with the finding in the first lines and a full account of what is not done.</w:t>
+        <w:t xml:space="preserve"> infographic/asset_pack.md with the headline, the calendar strip, four figure choices, the palette, and a complete table that traces each number to its source, so every figure on the design can be checked. I wrote README.md last, as I had planned, with the finding in the first lines and a full account of what is not done.</w:t>
       </w:r>
     </w:p>
     <w:p>
@@ -27410,7 +27405,7 @@
         <w:t>Skipped:</w:t>
       </w:r>
       <w:r>
-        <w:t xml:space="preserve"> The Canva working file and the PDF export. Canva is a browser application that cannot be driven from a script. Everything that would be decided in front of it is decided in the asset pack, and the same story is already built and verified as a web page.</w:t>
+        <w:t xml:space="preserve"> The Canva working file and the PDF export. Canva is a browser application that cannot be driven from a script. Everything I would decide in front of it is already decided in the asset pack, and the same story is already built and checked as a web page.</w:t>
       </w:r>
     </w:p>
     <w:p>
@@ -27418,7 +27413,7 @@
         <w:pStyle w:val="Heading3"/>
       </w:pPr>
       <w:r>
-        <w:t>Rescope - all nine modules now build without any credential</w:t>
+        <w:t>Rescope. All nine modules now build without any credential</w:t>
       </w:r>
     </w:p>
     <w:p>
@@ -27446,7 +27441,7 @@
         <w:t>Produced:</w:t>
       </w:r>
       <w:r>
-        <w:t xml:space="preserve"> Modules 3.1, 3.4, 4, 5.3, 5.4 and 7 rebuilt on data obtainable without a key: narrative tone over chapter summaries, product line scaling, k-means product archetypes over 14,950 sets, a set-size regression, a spell-category text classifier, and a pandas vs Dask comparison over 1.56m rows of part inventory scaled to 12.5m. Module 9 infographic now generated as PNG and PDF from outputs/tables. Nine findings; 24 scripts run unattended end to end.</w:t>
+        <w:t xml:space="preserve"> I rebuilt modules 3.1, 3.4, 4, 5.3, 5.4 and 7 on data I can get without a key: narrative tone over chapter summaries, product line scaling, k-means product archetypes over 14,950 sets, a set size regression, a text classifier for spell categories, and a pandas vs Dask comparison over 1.56m rows of part inventory scaled to 12.5m. The module 9 infographic is now generated as PNG and PDF from outputs/tables. Nine findings. 24 scripts run from start to finish with nobody watching.</w:t>
       </w:r>
     </w:p>
     <w:p>
@@ -27460,7 +27455,57 @@
         <w:t>Skipped:</w:t>
       </w:r>
       <w:r>
-        <w:t xml:space="preserve"> The .pbix file and its screenshots, and the Canva working file. Both need desktop software. Every substitute module is labelled as a substitute in its docstring, its finding and the README.</w:t>
+        <w:t xml:space="preserve"> The .pbix file and its screenshots, and the Canva working file. Both need desktop software. I label every substitute module as a substitute in its docstring, in its finding and in the README.</w:t>
+      </w:r>
+    </w:p>
+    <w:p>
+      <w:pPr>
+        <w:pStyle w:val="Heading3"/>
+      </w:pPr>
+      <w:r>
+        <w:t>Final review. Docs in my own words and a last check of every number</w:t>
+      </w:r>
+    </w:p>
+    <w:p>
+      <w:pPr>
+        <w:pStyle w:val="ListBullet"/>
+      </w:pPr>
+      <w:r>
+        <w:rPr>
+          <w:b/>
+        </w:rPr>
+        <w:t>When:</w:t>
+      </w:r>
+      <w:r>
+        <w:t xml:space="preserve"> 2026-10-17 05:00 UTC</w:t>
+      </w:r>
+    </w:p>
+    <w:p>
+      <w:pPr>
+        <w:pStyle w:val="ListBullet"/>
+      </w:pPr>
+      <w:r>
+        <w:rPr>
+          <w:b/>
+        </w:rPr>
+        <w:t>Produced:</w:t>
+      </w:r>
+      <w:r>
+        <w:t xml:space="preserve"> I rewrote every comment, docstring and document in my own words and took the hyphens out of the prose. The project now has eleven findings in docs/findings.md, two more than the nine in the entry above. I checked every number in the README against outputs/tables and the collection logs. The counts there come from the last collection run on 3 September: 222,799 Statistics Canada rows and 1.66m Rebrickable rows across 5 tables, so they differ from the first entry in this log. I opened the Power BI project in Power BI Desktop 2.150 and saved my own .pbix, which is now in the repository as dashboard/DataWizardry.pbix. I removed infographic/asset_pack.md on purpose, because a list kept by hand goes stale, and 28_infographic.py now reads every number from outputs/tables. I dropped nltk from requirements.txt, because only vaderSentiment is used. I moved the methods note, the ethics note, the open questions and the build walkthrough from Word into Markdown in docs/, because as Word only files they kept describing the old project. 60_build_report.py now builds every Word file from Markdown on each run.</w:t>
+      </w:r>
+    </w:p>
+    <w:p>
+      <w:pPr>
+        <w:pStyle w:val="ListBullet"/>
+      </w:pPr>
+      <w:r>
+        <w:rPr>
+          <w:b/>
+        </w:rPr>
+        <w:t>Skipped:</w:t>
+      </w:r>
+      <w:r>
+        <w:t xml:space="preserve"> Nothing new. The gaps listed above still stand: no fan text, no retail prices and no number on brand risk.</w:t>
       </w:r>
     </w:p>
     <w:p>

</xml_diff>